<commit_message>
BP 15 e-bikes: ajout tableaux financement/déblocage/crédit fournisseur, total projet laissé ouvert (assiette primable = MAROC PME), piscine repositionnée en équipement de soutien
Co-Authored-By: Claude Opus 4.8 <noreply@anthropic.com>
Claude-Session: https://claude.ai/code/session_01TuoVA1diyL6DwFpHFRPjqd
</commit_message>
<xml_diff>
--- a/DA21_Business_Plan_15ebikes_VF.docx
+++ b/DA21_Business_Plan_15ebikes_VF.docx
@@ -96,7 +96,7 @@
           <w:i w:val="0"/>
           <w:sz w:val="21"/>
         </w:rPr>
-        <w:t>Ce document fournit (1) un prompt prêt à coller pour actualiser le BP graphique existant (version 10 e-bikes) sans en modifier les textes, la structure ni les couleurs, et (2) la version intégrale et exhaustive du BP recalée sur le dossier Excel VF et le DAP (scénario 15 e-bikes, investissement 983 486 DH, montage conforme GO SIYAHA : fonds propres 15 % / CMT 50 % / prime 35 %).</w:t>
+        <w:t>Ce document fournit (1) un prompt prêt à coller pour actualiser le BP graphique existant (version 10 e-bikes) sans en modifier les textes, la structure ni les couleurs, et (2) la version intégrale et exhaustive du BP recalée sur le dossier Excel VF et le DAP (scénario 15 e-bikes, investissement global 983 486 DH).</w:t>
       </w:r>
     </w:p>
     <w:p>
@@ -136,7 +136,7 @@
                 <w:color w:val="152E1F"/>
                 <w:sz w:val="20"/>
               </w:rPr>
-              <w:t>« Mets à jour le business plan DA21 ci-joint en ne changeant QUE les chiffres, sans toucher à la mise en page, à la structure des sections, aux couleurs, ni aux textes — sauf lorsqu’une phrase cite un chiffre modifié (ex. « 10 vélos », un montant d’investissement, un montant de CA ou de financement) : dans ce cas, mets le texte en cohérence avec le nouveau chiffre, et rien de plus. Applique strictement le tableau de correspondance ancien → nouveau ci-dessous. Corrige aussi deux coquilles : le nom du gérant est « Karim ZOUBDANE » (et non ZOUDANE), et la forme juridique est « DA21 SARL AU » (société à associé unique). Conserve à l’identique tout le reste. »</w:t>
+              <w:t>« Mets à jour le business plan DA21 ci-joint en ne changeant QUE les chiffres, sans toucher à la mise en page, à la structure des sections, aux couleurs, ni aux textes — sauf lorsqu’une phrase cite un chiffre modifié (ex. « 10 vélos », un montant d’investissement, de CA ou de financement) : dans ce cas, mets le texte en cohérence avec le nouveau chiffre, et rien de plus. Applique strictement le tableau de correspondance ancien → nouveau ci-dessous. Présente le total du projet pour son montant global, SANS répartir toi-même entre partie primable et non primable (l’assiette primable sera arrêtée par MAROC PME). Positionne la piscine comme un équipement de soutien qui fait prospérer les autres activités. Corrige deux coquilles : « Karim ZOUBDANE » (et non ZOUDANE) et la forme « DA21 SARL AU ». Conserve à l’identique tout le reste. »</w:t>
             </w:r>
           </w:p>
         </w:tc>
@@ -382,7 +382,7 @@
                 <w:b w:val="0"/>
                 <w:sz w:val="19"/>
               </w:rPr>
-              <w:t>104 400 DH (10,2 %)</w:t>
+              <w:t>104 400 DH</w:t>
             </w:r>
           </w:p>
         </w:tc>
@@ -401,7 +401,7 @@
                 <w:b w:val="0"/>
                 <w:sz w:val="19"/>
               </w:rPr>
-              <w:t>147 523 DH (15,0 %) — capital 20 000 + CCA 127 523</w:t>
+              <w:t>147 523 DH (programme) — 267 523 DH mobilisés au total</w:t>
             </w:r>
           </w:p>
         </w:tc>
@@ -440,7 +440,7 @@
                 <w:b w:val="0"/>
                 <w:sz w:val="19"/>
               </w:rPr>
-              <w:t>597 550 DH (58,3 %)</w:t>
+              <w:t>597 550 DH</w:t>
             </w:r>
           </w:p>
         </w:tc>
@@ -459,7 +459,7 @@
                 <w:b w:val="0"/>
                 <w:sz w:val="19"/>
               </w:rPr>
-              <w:t>491 743 DH (50,0 %)</w:t>
+              <w:t>491 743 DH</w:t>
             </w:r>
           </w:p>
         </w:tc>
@@ -479,7 +479,7 @@
                 <w:b/>
                 <w:sz w:val="19"/>
               </w:rPr>
-              <w:t>Prime GO SIYAHA</w:t>
+              <w:t>Prime GO SIYAHA (sollicitée)</w:t>
             </w:r>
           </w:p>
         </w:tc>
@@ -517,7 +517,7 @@
                 <w:b w:val="0"/>
                 <w:sz w:val="19"/>
               </w:rPr>
-              <w:t>344 220 DH (35 %)</w:t>
+              <w:t>344 220 DH</w:t>
             </w:r>
           </w:p>
         </w:tc>
@@ -933,19 +933,6 @@
       <w:pPr>
         <w:spacing w:after="40"/>
       </w:pPr>
-    </w:p>
-    <w:p>
-      <w:pPr>
-        <w:spacing w:after="40"/>
-        <w:jc w:val="both"/>
-      </w:pPr>
-      <w:r>
-        <w:rPr>
-          <w:i/>
-          <w:sz w:val="19"/>
-        </w:rPr>
-        <w:t>Note : tous les autres blocs de texte (concept, positionnement, segments, concurrence, marketing, risques, conclusion) restent valables tels quels ; ils ne sont pas modifiés.</w:t>
-      </w:r>
     </w:p>
     <w:p>
       <w:pPr>
@@ -1081,7 +1068,7 @@
         <w:rPr>
           <w:sz w:val="21"/>
         </w:rPr>
-        <w:t>11.  Plan d’investissement &amp; financement</w:t>
+        <w:t>11.  Plan d’investissement, financement &amp; échéancier de trésorerie</w:t>
       </w:r>
     </w:p>
     <w:p>
@@ -1232,7 +1219,7 @@
                 <w:b w:val="0"/>
                 <w:sz w:val="19"/>
               </w:rPr>
-              <w:t>Complexe d’animation touristique intégré sur 1 ha d’oliveraie adulte, 3 offres : e-bike/Fatbike (15 vélos), paintball (20 joueurs), ateliers cuisine (15 places). Piscine = prestation complémentaire de détente.</w:t>
+              <w:t>Complexe d’animation touristique intégré sur 1 ha d’oliveraie adulte, 3 activités : e-bike/Fatbike (15 vélos), paintball (20 joueurs), ateliers cuisine (15 places). La piscine est un équipement de soutien qui fait prospérer ces activités.</w:t>
             </w:r>
           </w:p>
         </w:tc>
@@ -1271,7 +1258,7 @@
                 <w:b w:val="0"/>
                 <w:sz w:val="19"/>
               </w:rPr>
-              <w:t>Investissement global 983 486 DH. Fonds propres (capital + CCA) 147 523 DH (15 %). CMT bancaire 491 743 DH (50 %). Prime GO SIYAHA 344 220 DH (35 %).</w:t>
+              <w:t>Investissement global 983 486 DH. Financement : fonds propres + CCA 147 523 DH, CMT bancaire 491 743 DH, prime GO SIYAHA sollicitée 344 220 DH.</w:t>
             </w:r>
           </w:p>
         </w:tc>
@@ -1692,7 +1679,7 @@
                 <w:b/>
                 <w:sz w:val="19"/>
               </w:rPr>
-              <w:t>Piscine</w:t>
+              <w:t>Piscine (équipement de soutien)</w:t>
             </w:r>
           </w:p>
         </w:tc>
@@ -1711,7 +1698,7 @@
                 <w:b w:val="0"/>
                 <w:sz w:val="19"/>
               </w:rPr>
-              <w:t>Prestation complémentaire de détente après activité : levier d’attractivité estivale et argument commercial.</w:t>
+              <w:t>Équipement qui fait prospérer les autres activités : il prolonge la durée de visite, augmente le panier moyen (activité + repas + détente), soutient la fréquentation estivale et renforce l’attractivité des formules journée combinant e-bike, paintball et ateliers cuisine.</w:t>
             </w:r>
           </w:p>
         </w:tc>
@@ -2355,7 +2342,7 @@
                 <w:b w:val="0"/>
                 <w:sz w:val="19"/>
               </w:rPr>
-              <w:t>Paintball, e-bike, ateliers cuisine + piscine détente.</w:t>
+              <w:t>Paintball, e-bike, ateliers cuisine ; piscine en appui de la détente.</w:t>
             </w:r>
           </w:p>
         </w:tc>
@@ -2471,7 +2458,7 @@
                 <w:b w:val="0"/>
                 <w:sz w:val="19"/>
               </w:rPr>
-              <w:t>Jardin à l’assiette, ateliers cuisine, promenade, piscine.</w:t>
+              <w:t>Jardin à l’assiette, ateliers cuisine, promenade ; piscine en appui.</w:t>
             </w:r>
           </w:p>
         </w:tc>
@@ -2529,7 +2516,7 @@
                 <w:b w:val="0"/>
                 <w:sz w:val="19"/>
               </w:rPr>
-              <w:t>Paintball, e-bike, cuisine + piscine, formules journée.</w:t>
+              <w:t>Paintball, e-bike, cuisine ; piscine en appui, formules journée.</w:t>
             </w:r>
           </w:p>
         </w:tc>
@@ -2587,7 +2574,7 @@
                 <w:b w:val="0"/>
                 <w:sz w:val="19"/>
               </w:rPr>
-              <w:t>E-bike, ateliers cuisine, demi-journée, piscine détente.</w:t>
+              <w:t>E-bike, ateliers cuisine, demi-journée ; piscine en appui.</w:t>
             </w:r>
           </w:p>
         </w:tc>
@@ -2843,7 +2830,7 @@
                 <w:b w:val="0"/>
                 <w:sz w:val="19"/>
               </w:rPr>
-              <w:t>Jour ET nocturne UV/Blacklight, combinable e-bike/cuisine/piscine, anniversaires, EVG/EVJF, team-building.</w:t>
+              <w:t>Jour ET nocturne UV/Blacklight, combinable e-bike/cuisine, anniversaires, EVG/EVJF, team-building ; piscine en appui.</w:t>
             </w:r>
           </w:p>
         </w:tc>
@@ -3055,7 +3042,7 @@
                 <w:b w:val="0"/>
                 <w:sz w:val="19"/>
               </w:rPr>
-              <w:t>Capter les recherches de proximité (activités enfants, piscine + repas, paintball, route Ourika / Al Haouz).</w:t>
+              <w:t>Capter les recherches de proximité (activités enfants, paintball, route Ourika / Al Haouz).</w:t>
             </w:r>
           </w:p>
         </w:tc>
@@ -3094,7 +3081,7 @@
                 <w:b w:val="0"/>
                 <w:sz w:val="19"/>
               </w:rPr>
-              <w:t>Valoriser le cadre naturel, anniversaires, groupes, ateliers cuisine, piscine, expériences journée.</w:t>
+              <w:t>Valoriser le cadre naturel, anniversaires, groupes, ateliers cuisine, expériences journée.</w:t>
             </w:r>
           </w:p>
         </w:tc>
@@ -3506,7 +3493,7 @@
           <w:color w:val="1B3A28"/>
           <w:sz w:val="28"/>
         </w:rPr>
-        <w:t>11.  Plan d’investissement &amp; financement</w:t>
+        <w:t>11.  Plan d’investissement, financement &amp; échéancier de trésorerie</w:t>
       </w:r>
     </w:p>
     <w:p>
@@ -3729,7 +3716,7 @@
                 <w:b/>
                 <w:sz w:val="19"/>
               </w:rPr>
-              <w:t>Aménagement &amp; agencement</w:t>
+              <w:t>Aménagement &amp; infrastructure</w:t>
             </w:r>
           </w:p>
         </w:tc>
@@ -3905,7 +3892,7 @@
                 <w:color w:val="1B3A28"/>
                 <w:sz w:val="19"/>
               </w:rPr>
-              <w:t>Investissement total</w:t>
+              <w:t>Total projet</w:t>
             </w:r>
           </w:p>
         </w:tc>
@@ -3947,6 +3934,796 @@
                 <w:sz w:val="19"/>
               </w:rPr>
               <w:t>983 486</w:t>
+            </w:r>
+          </w:p>
+        </w:tc>
+      </w:tr>
+    </w:tbl>
+    <w:p>
+      <w:pPr>
+        <w:spacing w:after="40"/>
+      </w:pPr>
+    </w:p>
+    <w:p>
+      <w:pPr>
+        <w:spacing w:after="80"/>
+        <w:jc w:val="both"/>
+      </w:pPr>
+      <w:r>
+        <w:rPr>
+          <w:i/>
+          <w:sz w:val="21"/>
+        </w:rPr>
+        <w:t>Le programme est présenté pour son montant global. La détermination de l’assiette primable / non primable relève exclusivement de l’appréciation de MAROC PME ; le promoteur ne préjuge pas de cette répartition.</w:t>
+      </w:r>
+    </w:p>
+    <w:p>
+      <w:pPr>
+        <w:spacing w:before="160" w:after="40"/>
+      </w:pPr>
+      <w:r>
+        <w:rPr>
+          <w:b/>
+          <w:color w:val="152E1F"/>
+          <w:sz w:val="23"/>
+        </w:rPr>
+        <w:t>A. Plan de financement</w:t>
+      </w:r>
+    </w:p>
+    <w:tbl>
+      <w:tblPr>
+        <w:tblStyle w:val="TableGrid"/>
+        <w:tblW w:type="auto" w:w="0"/>
+        <w:jc w:val="center"/>
+        <w:tblLook w:firstColumn="1" w:firstRow="1" w:lastColumn="0" w:lastRow="0" w:noHBand="0" w:noVBand="1" w:val="04A0"/>
+      </w:tblPr>
+      <w:tblGrid>
+        <w:gridCol w:w="3400"/>
+        <w:gridCol w:w="3400"/>
+        <w:gridCol w:w="3400"/>
+      </w:tblGrid>
+      <w:tr>
+        <w:tc>
+          <w:tcPr>
+            <w:tcW w:type="dxa" w:w="5386"/>
+            <w:shd w:val="clear" w:fill="1B3A28"/>
+          </w:tcPr>
+          <w:p>
+            <w:pPr>
+              <w:spacing w:after="20" w:before="20"/>
+            </w:pPr>
+            <w:r/>
+            <w:r>
+              <w:rPr>
+                <w:b/>
+                <w:color w:val="FFFFFF"/>
+                <w:sz w:val="19"/>
+              </w:rPr>
+              <w:t>Ressource</w:t>
+            </w:r>
+          </w:p>
+        </w:tc>
+        <w:tc>
+          <w:tcPr>
+            <w:tcW w:type="dxa" w:w="2268"/>
+            <w:shd w:val="clear" w:fill="1B3A28"/>
+          </w:tcPr>
+          <w:p>
+            <w:pPr>
+              <w:spacing w:after="20" w:before="20"/>
+              <w:jc w:val="center"/>
+            </w:pPr>
+            <w:r/>
+            <w:r>
+              <w:rPr>
+                <w:b/>
+                <w:color w:val="FFFFFF"/>
+                <w:sz w:val="19"/>
+              </w:rPr>
+              <w:t>Montant (DH)</w:t>
+            </w:r>
+          </w:p>
+        </w:tc>
+        <w:tc>
+          <w:tcPr>
+            <w:tcW w:type="dxa" w:w="1701"/>
+            <w:shd w:val="clear" w:fill="1B3A28"/>
+          </w:tcPr>
+          <w:p>
+            <w:pPr>
+              <w:spacing w:after="20" w:before="20"/>
+              <w:jc w:val="center"/>
+            </w:pPr>
+            <w:r/>
+            <w:r>
+              <w:rPr>
+                <w:b/>
+                <w:color w:val="FFFFFF"/>
+                <w:sz w:val="19"/>
+              </w:rPr>
+              <w:t>Part du programme</w:t>
+            </w:r>
+          </w:p>
+        </w:tc>
+      </w:tr>
+      <w:tr>
+        <w:tc>
+          <w:tcPr>
+            <w:tcW w:type="dxa" w:w="5386"/>
+          </w:tcPr>
+          <w:p>
+            <w:pPr>
+              <w:spacing w:after="20" w:before="20"/>
+            </w:pPr>
+            <w:r/>
+            <w:r>
+              <w:rPr>
+                <w:b/>
+                <w:sz w:val="19"/>
+              </w:rPr>
+              <w:t>Fonds propres + comptes courants d’associés</w:t>
+            </w:r>
+          </w:p>
+        </w:tc>
+        <w:tc>
+          <w:tcPr>
+            <w:tcW w:type="dxa" w:w="2268"/>
+          </w:tcPr>
+          <w:p>
+            <w:pPr>
+              <w:spacing w:after="20" w:before="20"/>
+              <w:jc w:val="center"/>
+            </w:pPr>
+            <w:r/>
+            <w:r>
+              <w:rPr>
+                <w:b w:val="0"/>
+                <w:sz w:val="19"/>
+              </w:rPr>
+              <w:t>147 523</w:t>
+            </w:r>
+          </w:p>
+        </w:tc>
+        <w:tc>
+          <w:tcPr>
+            <w:tcW w:type="dxa" w:w="1701"/>
+          </w:tcPr>
+          <w:p>
+            <w:pPr>
+              <w:spacing w:after="20" w:before="20"/>
+              <w:jc w:val="center"/>
+            </w:pPr>
+            <w:r/>
+            <w:r>
+              <w:rPr>
+                <w:b w:val="0"/>
+                <w:sz w:val="19"/>
+              </w:rPr>
+              <w:t>15,0 %</w:t>
+            </w:r>
+          </w:p>
+        </w:tc>
+      </w:tr>
+      <w:tr>
+        <w:tc>
+          <w:tcPr>
+            <w:tcW w:type="dxa" w:w="5386"/>
+          </w:tcPr>
+          <w:p>
+            <w:pPr>
+              <w:spacing w:after="20" w:before="20"/>
+            </w:pPr>
+            <w:r/>
+            <w:r>
+              <w:rPr>
+                <w:b/>
+                <w:sz w:val="19"/>
+              </w:rPr>
+              <w:t>Crédit à moyen terme (CMT)</w:t>
+            </w:r>
+          </w:p>
+        </w:tc>
+        <w:tc>
+          <w:tcPr>
+            <w:tcW w:type="dxa" w:w="2268"/>
+          </w:tcPr>
+          <w:p>
+            <w:pPr>
+              <w:spacing w:after="20" w:before="20"/>
+              <w:jc w:val="center"/>
+            </w:pPr>
+            <w:r/>
+            <w:r>
+              <w:rPr>
+                <w:b w:val="0"/>
+                <w:sz w:val="19"/>
+              </w:rPr>
+              <w:t>491 743</w:t>
+            </w:r>
+          </w:p>
+        </w:tc>
+        <w:tc>
+          <w:tcPr>
+            <w:tcW w:type="dxa" w:w="1701"/>
+          </w:tcPr>
+          <w:p>
+            <w:pPr>
+              <w:spacing w:after="20" w:before="20"/>
+              <w:jc w:val="center"/>
+            </w:pPr>
+            <w:r/>
+            <w:r>
+              <w:rPr>
+                <w:b w:val="0"/>
+                <w:sz w:val="19"/>
+              </w:rPr>
+              <w:t>50,0 %</w:t>
+            </w:r>
+          </w:p>
+        </w:tc>
+      </w:tr>
+      <w:tr>
+        <w:tc>
+          <w:tcPr>
+            <w:tcW w:type="dxa" w:w="5386"/>
+          </w:tcPr>
+          <w:p>
+            <w:pPr>
+              <w:spacing w:after="20" w:before="20"/>
+            </w:pPr>
+            <w:r/>
+            <w:r>
+              <w:rPr>
+                <w:b/>
+                <w:sz w:val="19"/>
+              </w:rPr>
+              <w:t>Prime GO SIYAHA (sollicitée, taux 35 %)</w:t>
+            </w:r>
+          </w:p>
+        </w:tc>
+        <w:tc>
+          <w:tcPr>
+            <w:tcW w:type="dxa" w:w="2268"/>
+          </w:tcPr>
+          <w:p>
+            <w:pPr>
+              <w:spacing w:after="20" w:before="20"/>
+              <w:jc w:val="center"/>
+            </w:pPr>
+            <w:r/>
+            <w:r>
+              <w:rPr>
+                <w:b w:val="0"/>
+                <w:sz w:val="19"/>
+              </w:rPr>
+              <w:t>344 220</w:t>
+            </w:r>
+          </w:p>
+        </w:tc>
+        <w:tc>
+          <w:tcPr>
+            <w:tcW w:type="dxa" w:w="1701"/>
+          </w:tcPr>
+          <w:p>
+            <w:pPr>
+              <w:spacing w:after="20" w:before="20"/>
+              <w:jc w:val="center"/>
+            </w:pPr>
+            <w:r/>
+            <w:r>
+              <w:rPr>
+                <w:b w:val="0"/>
+                <w:sz w:val="19"/>
+              </w:rPr>
+              <w:t>35,0 %</w:t>
+            </w:r>
+          </w:p>
+        </w:tc>
+      </w:tr>
+      <w:tr>
+        <w:tc>
+          <w:tcPr>
+            <w:tcW w:type="dxa" w:w="5386"/>
+            <w:shd w:val="clear" w:fill="EFE7D6"/>
+          </w:tcPr>
+          <w:p>
+            <w:pPr>
+              <w:spacing w:after="20" w:before="20"/>
+            </w:pPr>
+            <w:r/>
+            <w:r>
+              <w:rPr>
+                <w:b/>
+                <w:color w:val="1B3A28"/>
+                <w:sz w:val="19"/>
+              </w:rPr>
+              <w:t>Total financement du programme</w:t>
+            </w:r>
+          </w:p>
+        </w:tc>
+        <w:tc>
+          <w:tcPr>
+            <w:tcW w:type="dxa" w:w="2268"/>
+            <w:shd w:val="clear" w:fill="EFE7D6"/>
+          </w:tcPr>
+          <w:p>
+            <w:pPr>
+              <w:spacing w:after="20" w:before="20"/>
+              <w:jc w:val="center"/>
+            </w:pPr>
+            <w:r/>
+            <w:r>
+              <w:rPr>
+                <w:b/>
+                <w:color w:val="1B3A28"/>
+                <w:sz w:val="19"/>
+              </w:rPr>
+              <w:t>983 486</w:t>
+            </w:r>
+          </w:p>
+        </w:tc>
+        <w:tc>
+          <w:tcPr>
+            <w:tcW w:type="dxa" w:w="1701"/>
+            <w:shd w:val="clear" w:fill="EFE7D6"/>
+          </w:tcPr>
+          <w:p>
+            <w:pPr>
+              <w:spacing w:after="20" w:before="20"/>
+              <w:jc w:val="center"/>
+            </w:pPr>
+            <w:r/>
+            <w:r>
+              <w:rPr>
+                <w:b/>
+                <w:color w:val="1B3A28"/>
+                <w:sz w:val="19"/>
+              </w:rPr>
+              <w:t>100 %</w:t>
+            </w:r>
+          </w:p>
+        </w:tc>
+      </w:tr>
+    </w:tbl>
+    <w:p>
+      <w:pPr>
+        <w:spacing w:after="40"/>
+      </w:pPr>
+    </w:p>
+    <w:p>
+      <w:pPr>
+        <w:spacing w:after="80"/>
+        <w:jc w:val="both"/>
+      </w:pPr>
+      <w:r>
+        <w:rPr>
+          <w:i/>
+          <w:sz w:val="21"/>
+        </w:rPr>
+        <w:t>Fonds propres réellement mobilisés par le promoteur (programme + besoin en fonds de roulement et trésorerie de démarrage) : 267 523 DH (capital 20 000 + comptes courants d’associés 247 523). Le promoteur apporte ainsi des fonds propres au-delà de la quote-part du programme.</w:t>
+      </w:r>
+    </w:p>
+    <w:p>
+      <w:pPr>
+        <w:spacing w:before="160" w:after="40"/>
+      </w:pPr>
+      <w:r>
+        <w:rPr>
+          <w:b/>
+          <w:color w:val="152E1F"/>
+          <w:sz w:val="23"/>
+        </w:rPr>
+        <w:t>B. Déblocage de la prime (20 % / 40 % / 40 %)</w:t>
+      </w:r>
+    </w:p>
+    <w:tbl>
+      <w:tblPr>
+        <w:tblStyle w:val="TableGrid"/>
+        <w:tblW w:type="auto" w:w="0"/>
+        <w:jc w:val="center"/>
+        <w:tblLook w:firstColumn="1" w:firstRow="1" w:lastColumn="0" w:lastRow="0" w:noHBand="0" w:noVBand="1" w:val="04A0"/>
+      </w:tblPr>
+      <w:tblGrid>
+        <w:gridCol w:w="2550"/>
+        <w:gridCol w:w="2550"/>
+        <w:gridCol w:w="2550"/>
+        <w:gridCol w:w="2550"/>
+      </w:tblGrid>
+      <w:tr>
+        <w:tc>
+          <w:tcPr>
+            <w:tcW w:type="dxa" w:w="2154"/>
+            <w:shd w:val="clear" w:fill="1B3A28"/>
+          </w:tcPr>
+          <w:p>
+            <w:pPr>
+              <w:spacing w:after="20" w:before="20"/>
+            </w:pPr>
+            <w:r/>
+            <w:r>
+              <w:rPr>
+                <w:b/>
+                <w:color w:val="FFFFFF"/>
+                <w:sz w:val="19"/>
+              </w:rPr>
+              <w:t>Tranche</w:t>
+            </w:r>
+          </w:p>
+        </w:tc>
+        <w:tc>
+          <w:tcPr>
+            <w:tcW w:type="dxa" w:w="4252"/>
+            <w:shd w:val="clear" w:fill="1B3A28"/>
+          </w:tcPr>
+          <w:p>
+            <w:pPr>
+              <w:spacing w:after="20" w:before="20"/>
+              <w:jc w:val="center"/>
+            </w:pPr>
+            <w:r/>
+            <w:r>
+              <w:rPr>
+                <w:b/>
+                <w:color w:val="FFFFFF"/>
+                <w:sz w:val="19"/>
+              </w:rPr>
+              <w:t>Déclencheur</w:t>
+            </w:r>
+          </w:p>
+        </w:tc>
+        <w:tc>
+          <w:tcPr>
+            <w:tcW w:type="dxa" w:w="1474"/>
+            <w:shd w:val="clear" w:fill="1B3A28"/>
+          </w:tcPr>
+          <w:p>
+            <w:pPr>
+              <w:spacing w:after="20" w:before="20"/>
+              <w:jc w:val="center"/>
+            </w:pPr>
+            <w:r/>
+            <w:r>
+              <w:rPr>
+                <w:b/>
+                <w:color w:val="FFFFFF"/>
+                <w:sz w:val="19"/>
+              </w:rPr>
+              <w:t>Montant (DH)</w:t>
+            </w:r>
+          </w:p>
+        </w:tc>
+        <w:tc>
+          <w:tcPr>
+            <w:tcW w:type="dxa" w:w="1474"/>
+            <w:shd w:val="clear" w:fill="1B3A28"/>
+          </w:tcPr>
+          <w:p>
+            <w:pPr>
+              <w:spacing w:after="20" w:before="20"/>
+              <w:jc w:val="center"/>
+            </w:pPr>
+            <w:r/>
+            <w:r>
+              <w:rPr>
+                <w:b/>
+                <w:color w:val="FFFFFF"/>
+                <w:sz w:val="19"/>
+              </w:rPr>
+              <w:t>Cumul reçu</w:t>
+            </w:r>
+          </w:p>
+        </w:tc>
+      </w:tr>
+      <w:tr>
+        <w:tc>
+          <w:tcPr>
+            <w:tcW w:type="dxa" w:w="2154"/>
+          </w:tcPr>
+          <w:p>
+            <w:pPr>
+              <w:spacing w:after="20" w:before="20"/>
+            </w:pPr>
+            <w:r/>
+            <w:r>
+              <w:rPr>
+                <w:b/>
+                <w:sz w:val="19"/>
+              </w:rPr>
+              <w:t>1re tranche — 20 %</w:t>
+            </w:r>
+          </w:p>
+        </w:tc>
+        <w:tc>
+          <w:tcPr>
+            <w:tcW w:type="dxa" w:w="4252"/>
+          </w:tcPr>
+          <w:p>
+            <w:pPr>
+              <w:spacing w:after="20" w:before="20"/>
+              <w:jc w:val="center"/>
+            </w:pPr>
+            <w:r/>
+            <w:r>
+              <w:rPr>
+                <w:b w:val="0"/>
+                <w:sz w:val="19"/>
+              </w:rPr>
+              <w:t>Démarrage / 1er constat de réalisation</w:t>
+            </w:r>
+          </w:p>
+        </w:tc>
+        <w:tc>
+          <w:tcPr>
+            <w:tcW w:type="dxa" w:w="1474"/>
+          </w:tcPr>
+          <w:p>
+            <w:pPr>
+              <w:spacing w:after="20" w:before="20"/>
+              <w:jc w:val="center"/>
+            </w:pPr>
+            <w:r/>
+            <w:r>
+              <w:rPr>
+                <w:b w:val="0"/>
+                <w:sz w:val="19"/>
+              </w:rPr>
+              <w:t>68 844</w:t>
+            </w:r>
+          </w:p>
+        </w:tc>
+        <w:tc>
+          <w:tcPr>
+            <w:tcW w:type="dxa" w:w="1474"/>
+          </w:tcPr>
+          <w:p>
+            <w:pPr>
+              <w:spacing w:after="20" w:before="20"/>
+              <w:jc w:val="center"/>
+            </w:pPr>
+            <w:r/>
+            <w:r>
+              <w:rPr>
+                <w:b w:val="0"/>
+                <w:sz w:val="19"/>
+              </w:rPr>
+              <w:t>68 844</w:t>
+            </w:r>
+          </w:p>
+        </w:tc>
+      </w:tr>
+      <w:tr>
+        <w:tc>
+          <w:tcPr>
+            <w:tcW w:type="dxa" w:w="2154"/>
+          </w:tcPr>
+          <w:p>
+            <w:pPr>
+              <w:spacing w:after="20" w:before="20"/>
+            </w:pPr>
+            <w:r/>
+            <w:r>
+              <w:rPr>
+                <w:b/>
+                <w:sz w:val="19"/>
+              </w:rPr>
+              <w:t>2e tranche — 40 %</w:t>
+            </w:r>
+          </w:p>
+        </w:tc>
+        <w:tc>
+          <w:tcPr>
+            <w:tcW w:type="dxa" w:w="4252"/>
+          </w:tcPr>
+          <w:p>
+            <w:pPr>
+              <w:spacing w:after="20" w:before="20"/>
+              <w:jc w:val="center"/>
+            </w:pPr>
+            <w:r/>
+            <w:r>
+              <w:rPr>
+                <w:b w:val="0"/>
+                <w:sz w:val="19"/>
+              </w:rPr>
+              <w:t>Avancement intermédiaire</w:t>
+            </w:r>
+          </w:p>
+        </w:tc>
+        <w:tc>
+          <w:tcPr>
+            <w:tcW w:type="dxa" w:w="1474"/>
+          </w:tcPr>
+          <w:p>
+            <w:pPr>
+              <w:spacing w:after="20" w:before="20"/>
+              <w:jc w:val="center"/>
+            </w:pPr>
+            <w:r/>
+            <w:r>
+              <w:rPr>
+                <w:b w:val="0"/>
+                <w:sz w:val="19"/>
+              </w:rPr>
+              <w:t>137 688</w:t>
+            </w:r>
+          </w:p>
+        </w:tc>
+        <w:tc>
+          <w:tcPr>
+            <w:tcW w:type="dxa" w:w="1474"/>
+          </w:tcPr>
+          <w:p>
+            <w:pPr>
+              <w:spacing w:after="20" w:before="20"/>
+              <w:jc w:val="center"/>
+            </w:pPr>
+            <w:r/>
+            <w:r>
+              <w:rPr>
+                <w:b w:val="0"/>
+                <w:sz w:val="19"/>
+              </w:rPr>
+              <w:t>206 532</w:t>
+            </w:r>
+          </w:p>
+        </w:tc>
+      </w:tr>
+      <w:tr>
+        <w:tc>
+          <w:tcPr>
+            <w:tcW w:type="dxa" w:w="2154"/>
+          </w:tcPr>
+          <w:p>
+            <w:pPr>
+              <w:spacing w:after="20" w:before="20"/>
+            </w:pPr>
+            <w:r/>
+            <w:r>
+              <w:rPr>
+                <w:b/>
+                <w:sz w:val="19"/>
+              </w:rPr>
+              <w:t>3e tranche — 40 %</w:t>
+            </w:r>
+          </w:p>
+        </w:tc>
+        <w:tc>
+          <w:tcPr>
+            <w:tcW w:type="dxa" w:w="4252"/>
+          </w:tcPr>
+          <w:p>
+            <w:pPr>
+              <w:spacing w:after="20" w:before="20"/>
+              <w:jc w:val="center"/>
+            </w:pPr>
+            <w:r/>
+            <w:r>
+              <w:rPr>
+                <w:b w:val="0"/>
+                <w:sz w:val="19"/>
+              </w:rPr>
+              <w:t>Achèvement / constat final</w:t>
+            </w:r>
+          </w:p>
+        </w:tc>
+        <w:tc>
+          <w:tcPr>
+            <w:tcW w:type="dxa" w:w="1474"/>
+          </w:tcPr>
+          <w:p>
+            <w:pPr>
+              <w:spacing w:after="20" w:before="20"/>
+              <w:jc w:val="center"/>
+            </w:pPr>
+            <w:r/>
+            <w:r>
+              <w:rPr>
+                <w:b w:val="0"/>
+                <w:sz w:val="19"/>
+              </w:rPr>
+              <w:t>137 688</w:t>
+            </w:r>
+          </w:p>
+        </w:tc>
+        <w:tc>
+          <w:tcPr>
+            <w:tcW w:type="dxa" w:w="1474"/>
+          </w:tcPr>
+          <w:p>
+            <w:pPr>
+              <w:spacing w:after="20" w:before="20"/>
+              <w:jc w:val="center"/>
+            </w:pPr>
+            <w:r/>
+            <w:r>
+              <w:rPr>
+                <w:b w:val="0"/>
+                <w:sz w:val="19"/>
+              </w:rPr>
+              <w:t>344 220</w:t>
+            </w:r>
+          </w:p>
+        </w:tc>
+      </w:tr>
+      <w:tr>
+        <w:tc>
+          <w:tcPr>
+            <w:tcW w:type="dxa" w:w="2154"/>
+            <w:shd w:val="clear" w:fill="EFE7D6"/>
+          </w:tcPr>
+          <w:p>
+            <w:pPr>
+              <w:spacing w:after="20" w:before="20"/>
+            </w:pPr>
+            <w:r/>
+            <w:r>
+              <w:rPr>
+                <w:b/>
+                <w:color w:val="1B3A28"/>
+                <w:sz w:val="19"/>
+              </w:rPr>
+              <w:t>Total prime</w:t>
+            </w:r>
+          </w:p>
+        </w:tc>
+        <w:tc>
+          <w:tcPr>
+            <w:tcW w:type="dxa" w:w="4252"/>
+            <w:shd w:val="clear" w:fill="EFE7D6"/>
+          </w:tcPr>
+          <w:p>
+            <w:pPr>
+              <w:spacing w:after="20" w:before="20"/>
+              <w:jc w:val="center"/>
+            </w:pPr>
+            <w:r/>
+            <w:r>
+              <w:rPr>
+                <w:b/>
+                <w:color w:val="1B3A28"/>
+                <w:sz w:val="19"/>
+              </w:rPr>
+            </w:r>
+          </w:p>
+        </w:tc>
+        <w:tc>
+          <w:tcPr>
+            <w:tcW w:type="dxa" w:w="1474"/>
+            <w:shd w:val="clear" w:fill="EFE7D6"/>
+          </w:tcPr>
+          <w:p>
+            <w:pPr>
+              <w:spacing w:after="20" w:before="20"/>
+              <w:jc w:val="center"/>
+            </w:pPr>
+            <w:r/>
+            <w:r>
+              <w:rPr>
+                <w:b/>
+                <w:color w:val="1B3A28"/>
+                <w:sz w:val="19"/>
+              </w:rPr>
+              <w:t>344 220</w:t>
+            </w:r>
+          </w:p>
+        </w:tc>
+        <w:tc>
+          <w:tcPr>
+            <w:tcW w:type="dxa" w:w="1474"/>
+            <w:shd w:val="clear" w:fill="EFE7D6"/>
+          </w:tcPr>
+          <w:p>
+            <w:pPr>
+              <w:spacing w:after="20" w:before="20"/>
+              <w:jc w:val="center"/>
+            </w:pPr>
+            <w:r/>
+            <w:r>
+              <w:rPr>
+                <w:b/>
+                <w:color w:val="1B3A28"/>
+                <w:sz w:val="19"/>
+              </w:rPr>
             </w:r>
           </w:p>
         </w:tc>
@@ -3967,7 +4744,20 @@
           <w:color w:val="152E1F"/>
           <w:sz w:val="23"/>
         </w:rPr>
-        <w:t>Plan de financement</w:t>
+        <w:t>C. Échéancier de trésorerie &amp; crédit fournisseur — zéro trou de trésorerie</w:t>
+      </w:r>
+    </w:p>
+    <w:p>
+      <w:pPr>
+        <w:spacing w:after="80"/>
+        <w:jc w:val="both"/>
+      </w:pPr>
+      <w:r>
+        <w:rPr>
+          <w:i w:val="0"/>
+          <w:sz w:val="21"/>
+        </w:rPr>
+        <w:t>La 3ᵉ tranche de prime (137 688 DH) n’est encaissée qu’après l’achèvement, alors que les fournisseurs doivent être réglés à la livraison. Pour neutraliser ce décalage sans financement bancaire supplémentaire, les fournisseurs hors e-bike (823 001 DH de factures) accordent un crédit fournisseur — simple report de règlement, à coût nul — d’un montant égal à la dernière tranche, remboursé dès son encaissement. Le CMT (491 743) et la prime (344 220) restent inchangés.</w:t>
       </w:r>
     </w:p>
     <w:tbl>
@@ -3978,14 +4768,15 @@
         <w:tblLook w:firstColumn="1" w:firstRow="1" w:lastColumn="0" w:lastRow="0" w:noHBand="0" w:noVBand="1" w:val="04A0"/>
       </w:tblPr>
       <w:tblGrid>
-        <w:gridCol w:w="3400"/>
-        <w:gridCol w:w="3400"/>
-        <w:gridCol w:w="3400"/>
+        <w:gridCol w:w="2550"/>
+        <w:gridCol w:w="2550"/>
+        <w:gridCol w:w="2550"/>
+        <w:gridCol w:w="2550"/>
       </w:tblGrid>
       <w:tr>
         <w:tc>
           <w:tcPr>
-            <w:tcW w:type="dxa" w:w="5386"/>
+            <w:tcW w:type="dxa" w:w="3742"/>
             <w:shd w:val="clear" w:fill="1B3A28"/>
           </w:tcPr>
           <w:p>
@@ -3999,13 +4790,13 @@
                 <w:color w:val="FFFFFF"/>
                 <w:sz w:val="19"/>
               </w:rPr>
-              <w:t>Ressource</w:t>
-            </w:r>
-          </w:p>
-        </w:tc>
-        <w:tc>
-          <w:tcPr>
-            <w:tcW w:type="dxa" w:w="2268"/>
+              <w:t>Étape</w:t>
+            </w:r>
+          </w:p>
+        </w:tc>
+        <w:tc>
+          <w:tcPr>
+            <w:tcW w:type="dxa" w:w="2041"/>
             <w:shd w:val="clear" w:fill="1B3A28"/>
           </w:tcPr>
           <w:p>
@@ -4020,13 +4811,13 @@
                 <w:color w:val="FFFFFF"/>
                 <w:sz w:val="19"/>
               </w:rPr>
-              <w:t>Montant (DH)</w:t>
-            </w:r>
-          </w:p>
-        </w:tc>
-        <w:tc>
-          <w:tcPr>
-            <w:tcW w:type="dxa" w:w="1701"/>
+              <w:t>Trésorerie sans crédit fourn.</w:t>
+            </w:r>
+          </w:p>
+        </w:tc>
+        <w:tc>
+          <w:tcPr>
+            <w:tcW w:type="dxa" w:w="2041"/>
             <w:shd w:val="clear" w:fill="1B3A28"/>
           </w:tcPr>
           <w:p>
@@ -4041,7 +4832,28 @@
                 <w:color w:val="FFFFFF"/>
                 <w:sz w:val="19"/>
               </w:rPr>
-              <w:t>Part</w:t>
+              <w:t>Crédit fournisseur</w:t>
+            </w:r>
+          </w:p>
+        </w:tc>
+        <w:tc>
+          <w:tcPr>
+            <w:tcW w:type="dxa" w:w="1361"/>
+            <w:shd w:val="clear" w:fill="1B3A28"/>
+          </w:tcPr>
+          <w:p>
+            <w:pPr>
+              <w:spacing w:after="20" w:before="20"/>
+              <w:jc w:val="center"/>
+            </w:pPr>
+            <w:r/>
+            <w:r>
+              <w:rPr>
+                <w:b/>
+                <w:color w:val="FFFFFF"/>
+                <w:sz w:val="19"/>
+              </w:rPr>
+              <w:t>Trésorerie nette</w:t>
             </w:r>
           </w:p>
         </w:tc>
@@ -4049,7 +4861,7 @@
       <w:tr>
         <w:tc>
           <w:tcPr>
-            <w:tcW w:type="dxa" w:w="5386"/>
+            <w:tcW w:type="dxa" w:w="3742"/>
           </w:tcPr>
           <w:p>
             <w:pPr>
@@ -4061,13 +4873,13 @@
                 <w:b/>
                 <w:sz w:val="19"/>
               </w:rPr>
-              <w:t>Fonds propres (capital 20 000 + comptes courants d’associés 127 523)</w:t>
-            </w:r>
-          </w:p>
-        </w:tc>
-        <w:tc>
-          <w:tcPr>
-            <w:tcW w:type="dxa" w:w="2268"/>
+              <w:t>Achèvement des travaux (3e tranche non encore reçue)</w:t>
+            </w:r>
+          </w:p>
+        </w:tc>
+        <w:tc>
+          <w:tcPr>
+            <w:tcW w:type="dxa" w:w="2041"/>
           </w:tcPr>
           <w:p>
             <w:pPr>
@@ -4080,13 +4892,13 @@
                 <w:b w:val="0"/>
                 <w:sz w:val="19"/>
               </w:rPr>
-              <w:t>147 523</w:t>
-            </w:r>
-          </w:p>
-        </w:tc>
-        <w:tc>
-          <w:tcPr>
-            <w:tcW w:type="dxa" w:w="1701"/>
+              <w:t>− 137 688</w:t>
+            </w:r>
+          </w:p>
+        </w:tc>
+        <w:tc>
+          <w:tcPr>
+            <w:tcW w:type="dxa" w:w="2041"/>
           </w:tcPr>
           <w:p>
             <w:pPr>
@@ -4099,7 +4911,26 @@
                 <w:b w:val="0"/>
                 <w:sz w:val="19"/>
               </w:rPr>
-              <w:t>15,0 %</w:t>
+              <w:t>+ 137 688 (report de règlement)</w:t>
+            </w:r>
+          </w:p>
+        </w:tc>
+        <w:tc>
+          <w:tcPr>
+            <w:tcW w:type="dxa" w:w="1361"/>
+          </w:tcPr>
+          <w:p>
+            <w:pPr>
+              <w:spacing w:after="20" w:before="20"/>
+              <w:jc w:val="center"/>
+            </w:pPr>
+            <w:r/>
+            <w:r>
+              <w:rPr>
+                <w:b w:val="0"/>
+                <w:sz w:val="19"/>
+              </w:rPr>
+              <w:t>0</w:t>
             </w:r>
           </w:p>
         </w:tc>
@@ -4107,7 +4938,7 @@
       <w:tr>
         <w:tc>
           <w:tcPr>
-            <w:tcW w:type="dxa" w:w="5386"/>
+            <w:tcW w:type="dxa" w:w="3742"/>
           </w:tcPr>
           <w:p>
             <w:pPr>
@@ -4119,13 +4950,13 @@
                 <w:b/>
                 <w:sz w:val="19"/>
               </w:rPr>
-              <w:t>Crédit à moyen terme (CMT)</w:t>
-            </w:r>
-          </w:p>
-        </w:tc>
-        <w:tc>
-          <w:tcPr>
-            <w:tcW w:type="dxa" w:w="2268"/>
+              <w:t>Réception de la 3e tranche GO SIYAHA</w:t>
+            </w:r>
+          </w:p>
+        </w:tc>
+        <w:tc>
+          <w:tcPr>
+            <w:tcW w:type="dxa" w:w="2041"/>
           </w:tcPr>
           <w:p>
             <w:pPr>
@@ -4138,13 +4969,13 @@
                 <w:b w:val="0"/>
                 <w:sz w:val="19"/>
               </w:rPr>
-              <w:t>491 743</w:t>
-            </w:r>
-          </w:p>
-        </w:tc>
-        <w:tc>
-          <w:tcPr>
-            <w:tcW w:type="dxa" w:w="1701"/>
+              <w:t>+ 137 688</w:t>
+            </w:r>
+          </w:p>
+        </w:tc>
+        <w:tc>
+          <w:tcPr>
+            <w:tcW w:type="dxa" w:w="2041"/>
           </w:tcPr>
           <w:p>
             <w:pPr>
@@ -4157,33 +4988,13 @@
                 <w:b w:val="0"/>
                 <w:sz w:val="19"/>
               </w:rPr>
-              <w:t>50,0 %</w:t>
-            </w:r>
-          </w:p>
-        </w:tc>
-      </w:tr>
-      <w:tr>
-        <w:tc>
-          <w:tcPr>
-            <w:tcW w:type="dxa" w:w="5386"/>
-          </w:tcPr>
-          <w:p>
-            <w:pPr>
-              <w:spacing w:after="20" w:before="20"/>
-            </w:pPr>
-            <w:r/>
-            <w:r>
-              <w:rPr>
-                <w:b/>
-                <w:sz w:val="19"/>
-              </w:rPr>
-              <w:t>Prime GO SIYAHA</w:t>
-            </w:r>
-          </w:p>
-        </w:tc>
-        <w:tc>
-          <w:tcPr>
-            <w:tcW w:type="dxa" w:w="2268"/>
+              <w:t>− 137 688 (règlement des fournisseurs)</w:t>
+            </w:r>
+          </w:p>
+        </w:tc>
+        <w:tc>
+          <w:tcPr>
+            <w:tcW w:type="dxa" w:w="1361"/>
           </w:tcPr>
           <w:p>
             <w:pPr>
@@ -4196,90 +5007,7 @@
                 <w:b w:val="0"/>
                 <w:sz w:val="19"/>
               </w:rPr>
-              <w:t>344 220</w:t>
-            </w:r>
-          </w:p>
-        </w:tc>
-        <w:tc>
-          <w:tcPr>
-            <w:tcW w:type="dxa" w:w="1701"/>
-          </w:tcPr>
-          <w:p>
-            <w:pPr>
-              <w:spacing w:after="20" w:before="20"/>
-              <w:jc w:val="center"/>
-            </w:pPr>
-            <w:r/>
-            <w:r>
-              <w:rPr>
-                <w:b w:val="0"/>
-                <w:sz w:val="19"/>
-              </w:rPr>
-              <w:t>35,0 %</w:t>
-            </w:r>
-          </w:p>
-        </w:tc>
-      </w:tr>
-      <w:tr>
-        <w:tc>
-          <w:tcPr>
-            <w:tcW w:type="dxa" w:w="5386"/>
-            <w:shd w:val="clear" w:fill="EFE7D6"/>
-          </w:tcPr>
-          <w:p>
-            <w:pPr>
-              <w:spacing w:after="20" w:before="20"/>
-            </w:pPr>
-            <w:r/>
-            <w:r>
-              <w:rPr>
-                <w:b/>
-                <w:color w:val="1B3A28"/>
-                <w:sz w:val="19"/>
-              </w:rPr>
-              <w:t>Total financement</w:t>
-            </w:r>
-          </w:p>
-        </w:tc>
-        <w:tc>
-          <w:tcPr>
-            <w:tcW w:type="dxa" w:w="2268"/>
-            <w:shd w:val="clear" w:fill="EFE7D6"/>
-          </w:tcPr>
-          <w:p>
-            <w:pPr>
-              <w:spacing w:after="20" w:before="20"/>
-              <w:jc w:val="center"/>
-            </w:pPr>
-            <w:r/>
-            <w:r>
-              <w:rPr>
-                <w:b/>
-                <w:color w:val="1B3A28"/>
-                <w:sz w:val="19"/>
-              </w:rPr>
-              <w:t>983 486</w:t>
-            </w:r>
-          </w:p>
-        </w:tc>
-        <w:tc>
-          <w:tcPr>
-            <w:tcW w:type="dxa" w:w="1701"/>
-            <w:shd w:val="clear" w:fill="EFE7D6"/>
-          </w:tcPr>
-          <w:p>
-            <w:pPr>
-              <w:spacing w:after="20" w:before="20"/>
-              <w:jc w:val="center"/>
-            </w:pPr>
-            <w:r/>
-            <w:r>
-              <w:rPr>
-                <w:b/>
-                <w:color w:val="1B3A28"/>
-                <w:sz w:val="19"/>
-              </w:rPr>
-              <w:t>100 %</w:t>
+              <w:t>0</w:t>
             </w:r>
           </w:p>
         </w:tc>
@@ -4300,340 +5028,8 @@
           <w:i/>
           <w:sz w:val="21"/>
         </w:rPr>
-        <w:t>Conformité GO SIYAHA : apport en fonds propres ≥ 15 % ✔ ; CMT ≤ 50 % ✔ ; prime 35 % du programme primable ✔.</w:t>
+        <w:t>Le pool de fournisseurs concernés (construction, paintball, aménagement, cuisine, solaire, architecte) représente 823 001 DH ; différer 137 688 DH n’en mobilise que ~17 %, adossé à une créance certaine sur MAROC PME. En cas de retard également sur la 2ᵉ tranche, le pont peut être étendu à 275 376 DH, toujours couvert par ce pool.</w:t>
       </w:r>
-    </w:p>
-    <w:p>
-      <w:pPr>
-        <w:spacing w:before="160" w:after="40"/>
-      </w:pPr>
-      <w:r>
-        <w:rPr>
-          <w:b/>
-          <w:color w:val="152E1F"/>
-          <w:sz w:val="23"/>
-        </w:rPr>
-        <w:t>Déblocage de la prime (20 % / 40 % / 40 %)</w:t>
-      </w:r>
-    </w:p>
-    <w:tbl>
-      <w:tblPr>
-        <w:tblStyle w:val="TableGrid"/>
-        <w:tblW w:type="auto" w:w="0"/>
-        <w:jc w:val="center"/>
-        <w:tblLook w:firstColumn="1" w:firstRow="1" w:lastColumn="0" w:lastRow="0" w:noHBand="0" w:noVBand="1" w:val="04A0"/>
-      </w:tblPr>
-      <w:tblGrid>
-        <w:gridCol w:w="3400"/>
-        <w:gridCol w:w="3400"/>
-        <w:gridCol w:w="3400"/>
-      </w:tblGrid>
-      <w:tr>
-        <w:tc>
-          <w:tcPr>
-            <w:tcW w:type="dxa" w:w="2268"/>
-            <w:shd w:val="clear" w:fill="1B3A28"/>
-          </w:tcPr>
-          <w:p>
-            <w:pPr>
-              <w:spacing w:after="20" w:before="20"/>
-            </w:pPr>
-            <w:r/>
-            <w:r>
-              <w:rPr>
-                <w:b/>
-                <w:color w:val="FFFFFF"/>
-                <w:sz w:val="19"/>
-              </w:rPr>
-              <w:t>Tranche</w:t>
-            </w:r>
-          </w:p>
-        </w:tc>
-        <w:tc>
-          <w:tcPr>
-            <w:tcW w:type="dxa" w:w="5102"/>
-            <w:shd w:val="clear" w:fill="1B3A28"/>
-          </w:tcPr>
-          <w:p>
-            <w:pPr>
-              <w:spacing w:after="20" w:before="20"/>
-              <w:jc w:val="center"/>
-            </w:pPr>
-            <w:r/>
-            <w:r>
-              <w:rPr>
-                <w:b/>
-                <w:color w:val="FFFFFF"/>
-                <w:sz w:val="19"/>
-              </w:rPr>
-              <w:t>Déclencheur</w:t>
-            </w:r>
-          </w:p>
-        </w:tc>
-        <w:tc>
-          <w:tcPr>
-            <w:tcW w:type="dxa" w:w="1984"/>
-            <w:shd w:val="clear" w:fill="1B3A28"/>
-          </w:tcPr>
-          <w:p>
-            <w:pPr>
-              <w:spacing w:after="20" w:before="20"/>
-              <w:jc w:val="center"/>
-            </w:pPr>
-            <w:r/>
-            <w:r>
-              <w:rPr>
-                <w:b/>
-                <w:color w:val="FFFFFF"/>
-                <w:sz w:val="19"/>
-              </w:rPr>
-              <w:t>Montant (DH)</w:t>
-            </w:r>
-          </w:p>
-        </w:tc>
-      </w:tr>
-      <w:tr>
-        <w:tc>
-          <w:tcPr>
-            <w:tcW w:type="dxa" w:w="2268"/>
-          </w:tcPr>
-          <w:p>
-            <w:pPr>
-              <w:spacing w:after="20" w:before="20"/>
-            </w:pPr>
-            <w:r/>
-            <w:r>
-              <w:rPr>
-                <w:b/>
-                <w:sz w:val="19"/>
-              </w:rPr>
-              <w:t>1re tranche (20 %)</w:t>
-            </w:r>
-          </w:p>
-        </w:tc>
-        <w:tc>
-          <w:tcPr>
-            <w:tcW w:type="dxa" w:w="5102"/>
-          </w:tcPr>
-          <w:p>
-            <w:pPr>
-              <w:spacing w:after="20" w:before="20"/>
-              <w:jc w:val="center"/>
-            </w:pPr>
-            <w:r/>
-            <w:r>
-              <w:rPr>
-                <w:b w:val="0"/>
-                <w:sz w:val="19"/>
-              </w:rPr>
-              <w:t>Démarrage / 1er constat de réalisation</w:t>
-            </w:r>
-          </w:p>
-        </w:tc>
-        <w:tc>
-          <w:tcPr>
-            <w:tcW w:type="dxa" w:w="1984"/>
-          </w:tcPr>
-          <w:p>
-            <w:pPr>
-              <w:spacing w:after="20" w:before="20"/>
-              <w:jc w:val="center"/>
-            </w:pPr>
-            <w:r/>
-            <w:r>
-              <w:rPr>
-                <w:b w:val="0"/>
-                <w:sz w:val="19"/>
-              </w:rPr>
-              <w:t>68 844</w:t>
-            </w:r>
-          </w:p>
-        </w:tc>
-      </w:tr>
-      <w:tr>
-        <w:tc>
-          <w:tcPr>
-            <w:tcW w:type="dxa" w:w="2268"/>
-          </w:tcPr>
-          <w:p>
-            <w:pPr>
-              <w:spacing w:after="20" w:before="20"/>
-            </w:pPr>
-            <w:r/>
-            <w:r>
-              <w:rPr>
-                <w:b/>
-                <w:sz w:val="19"/>
-              </w:rPr>
-              <w:t>2e tranche (40 %)</w:t>
-            </w:r>
-          </w:p>
-        </w:tc>
-        <w:tc>
-          <w:tcPr>
-            <w:tcW w:type="dxa" w:w="5102"/>
-          </w:tcPr>
-          <w:p>
-            <w:pPr>
-              <w:spacing w:after="20" w:before="20"/>
-              <w:jc w:val="center"/>
-            </w:pPr>
-            <w:r/>
-            <w:r>
-              <w:rPr>
-                <w:b w:val="0"/>
-                <w:sz w:val="19"/>
-              </w:rPr>
-              <w:t>Avancement intermédiaire</w:t>
-            </w:r>
-          </w:p>
-        </w:tc>
-        <w:tc>
-          <w:tcPr>
-            <w:tcW w:type="dxa" w:w="1984"/>
-          </w:tcPr>
-          <w:p>
-            <w:pPr>
-              <w:spacing w:after="20" w:before="20"/>
-              <w:jc w:val="center"/>
-            </w:pPr>
-            <w:r/>
-            <w:r>
-              <w:rPr>
-                <w:b w:val="0"/>
-                <w:sz w:val="19"/>
-              </w:rPr>
-              <w:t>137 688</w:t>
-            </w:r>
-          </w:p>
-        </w:tc>
-      </w:tr>
-      <w:tr>
-        <w:tc>
-          <w:tcPr>
-            <w:tcW w:type="dxa" w:w="2268"/>
-          </w:tcPr>
-          <w:p>
-            <w:pPr>
-              <w:spacing w:after="20" w:before="20"/>
-            </w:pPr>
-            <w:r/>
-            <w:r>
-              <w:rPr>
-                <w:b/>
-                <w:sz w:val="19"/>
-              </w:rPr>
-              <w:t>3e tranche (40 %)</w:t>
-            </w:r>
-          </w:p>
-        </w:tc>
-        <w:tc>
-          <w:tcPr>
-            <w:tcW w:type="dxa" w:w="5102"/>
-          </w:tcPr>
-          <w:p>
-            <w:pPr>
-              <w:spacing w:after="20" w:before="20"/>
-              <w:jc w:val="center"/>
-            </w:pPr>
-            <w:r/>
-            <w:r>
-              <w:rPr>
-                <w:b w:val="0"/>
-                <w:sz w:val="19"/>
-              </w:rPr>
-              <w:t>Achèvement / constat final</w:t>
-            </w:r>
-          </w:p>
-        </w:tc>
-        <w:tc>
-          <w:tcPr>
-            <w:tcW w:type="dxa" w:w="1984"/>
-          </w:tcPr>
-          <w:p>
-            <w:pPr>
-              <w:spacing w:after="20" w:before="20"/>
-              <w:jc w:val="center"/>
-            </w:pPr>
-            <w:r/>
-            <w:r>
-              <w:rPr>
-                <w:b w:val="0"/>
-                <w:sz w:val="19"/>
-              </w:rPr>
-              <w:t>137 688</w:t>
-            </w:r>
-          </w:p>
-        </w:tc>
-      </w:tr>
-      <w:tr>
-        <w:tc>
-          <w:tcPr>
-            <w:tcW w:type="dxa" w:w="2268"/>
-            <w:shd w:val="clear" w:fill="EFE7D6"/>
-          </w:tcPr>
-          <w:p>
-            <w:pPr>
-              <w:spacing w:after="20" w:before="20"/>
-            </w:pPr>
-            <w:r/>
-            <w:r>
-              <w:rPr>
-                <w:b/>
-                <w:color w:val="1B3A28"/>
-                <w:sz w:val="19"/>
-              </w:rPr>
-              <w:t>Total prime</w:t>
-            </w:r>
-          </w:p>
-        </w:tc>
-        <w:tc>
-          <w:tcPr>
-            <w:tcW w:type="dxa" w:w="5102"/>
-            <w:shd w:val="clear" w:fill="EFE7D6"/>
-          </w:tcPr>
-          <w:p>
-            <w:pPr>
-              <w:spacing w:after="20" w:before="20"/>
-              <w:jc w:val="center"/>
-            </w:pPr>
-            <w:r/>
-            <w:r>
-              <w:rPr>
-                <w:b/>
-                <w:color w:val="1B3A28"/>
-                <w:sz w:val="19"/>
-              </w:rPr>
-            </w:r>
-          </w:p>
-        </w:tc>
-        <w:tc>
-          <w:tcPr>
-            <w:tcW w:type="dxa" w:w="1984"/>
-            <w:shd w:val="clear" w:fill="EFE7D6"/>
-          </w:tcPr>
-          <w:p>
-            <w:pPr>
-              <w:spacing w:after="20" w:before="20"/>
-              <w:jc w:val="center"/>
-            </w:pPr>
-            <w:r/>
-            <w:r>
-              <w:rPr>
-                <w:b/>
-                <w:color w:val="1B3A28"/>
-                <w:sz w:val="19"/>
-              </w:rPr>
-              <w:t>344 220</w:t>
-            </w:r>
-          </w:p>
-        </w:tc>
-      </w:tr>
-    </w:tbl>
-    <w:p>
-      <w:pPr>
-        <w:spacing w:after="40"/>
-      </w:pPr>
     </w:p>
     <w:p>
       <w:pPr>
@@ -7342,7 +7738,7 @@
                 <w:b w:val="0"/>
                 <w:sz w:val="19"/>
               </w:rPr>
-              <w:t>Diversification : paintball, e-bike, cuisine, piscine, anniversaires, EVG/EVJF, team-building.</w:t>
+              <w:t>Diversification : paintball, e-bike, cuisine, piscine en appui, anniversaires, EVG/EVJF, team-building.</w:t>
             </w:r>
           </w:p>
         </w:tc>
@@ -7418,7 +7814,7 @@
           <w:i w:val="0"/>
           <w:sz w:val="21"/>
         </w:rPr>
-        <w:t>DA21 est un projet d’animation touristique intégré, conçu autour d’un site naturel existant de 1 hectare planté d’oliviers adultes, combinant loisirs, gastronomie, détente, terroir et activités de plein air. L’offre diversifiée — e-bike/Fatbike (15 vélos), paintball, ateliers cuisine, piscine complémentaire — touche familles, touristes, groupes privés, anniversaires, EVG/EVJF, entreprises, écoles et maisons d’hôtes.</w:t>
+        <w:t>DA21 est un projet d’animation touristique intégré, conçu autour d’un site naturel existant de 1 hectare planté d’oliviers adultes, combinant loisirs, gastronomie, détente, terroir et activités de plein air. L’offre diversifiée — e-bike/Fatbike (15 vélos), paintball, ateliers cuisine, soutenue par la piscine comme équipement d’appui — touche familles, touristes, groupes privés, anniversaires, EVG/EVJF, entreprises, écoles et maisons d’hôtes.</w:t>
       </w:r>
     </w:p>
     <w:p>
@@ -7431,7 +7827,7 @@
           <w:i w:val="0"/>
           <w:sz w:val="21"/>
         </w:rPr>
-        <w:t>Sur le plan financier, le projet repose sur un investissement global de 983 486 DH, financé à 15 % par fonds propres, 50 % par CMT et 35 % par la prime GO SIYAHA, dans le strict respect des plafonds du programme. Les hypothèses de fréquentation restent prudentes (taux d’occupation 18 % → 38 %), et la capacité d’autofinancement permet d’honorer le service de la dette avec une marge de sécurité confortable.</w:t>
+        <w:t>Sur le plan financier, le projet repose sur un investissement global de 983 486 DH, financé par fonds propres, CMT et prime GO SIYAHA sollicitée. Les hypothèses de fréquentation restent prudentes (taux d’occupation 18 % → 38 %), et la capacité d’autofinancement permet d’honorer le service de la dette avec une marge de sécurité confortable, le décalage de la dernière tranche de prime étant neutralisé par un crédit fournisseur à coût nul.</w:t>
       </w:r>
     </w:p>
     <w:p>

</xml_diff>

<commit_message>
BP: coût global du projet 1 103 486 DH (programme 983 486 + BFR 120 000), montage B (FP 147 523 / CMT 611 743 dont BFR / prime 344 220)
Co-Authored-By: Claude Opus 4.8 <noreply@anthropic.com>
Claude-Session: https://claude.ai/code/session_01TuoVA1diyL6DwFpHFRPjqd
</commit_message>
<xml_diff>
--- a/DA21_Business_Plan_15ebikes_VF.docx
+++ b/DA21_Business_Plan_15ebikes_VF.docx
@@ -96,7 +96,7 @@
           <w:i w:val="0"/>
           <w:sz w:val="21"/>
         </w:rPr>
-        <w:t>Ce document fournit (1) un prompt prêt à coller pour actualiser le BP graphique existant (version 10 e-bikes) sans en modifier les textes, la structure ni les couleurs, et (2) la version intégrale et exhaustive du BP recalée sur le dossier Excel VF et le DAP (scénario 15 e-bikes, investissement global 983 486 DH).</w:t>
+        <w:t>Ce document fournit (1) un prompt prêt à coller pour actualiser le BP graphique existant (version 10 e-bikes) sans en modifier les textes, la structure ni les couleurs, et (2) la version intégrale et exhaustive du BP recalée sur le dossier Excel VF et le DAP (scénario 15 e-bikes, coût global du projet 1 103 486 DH dont programme d’investissement 983 486 DH).</w:t>
       </w:r>
     </w:p>
     <w:p>
@@ -305,7 +305,7 @@
                 <w:b/>
                 <w:sz w:val="19"/>
               </w:rPr>
-              <w:t>Investissement total</w:t>
+              <w:t>Coût global du projet</w:t>
             </w:r>
           </w:p>
         </w:tc>
@@ -343,7 +343,7 @@
                 <w:b w:val="0"/>
                 <w:sz w:val="19"/>
               </w:rPr>
-              <w:t>983 486 DH</w:t>
+              <w:t>1 103 486 DH (programme 983 486 + BFR 120 000)</w:t>
             </w:r>
           </w:p>
         </w:tc>
@@ -363,7 +363,7 @@
                 <w:b/>
                 <w:sz w:val="19"/>
               </w:rPr>
-              <w:t>Apport / fonds propres</w:t>
+              <w:t>Apport / fonds propres + CCA</w:t>
             </w:r>
           </w:p>
         </w:tc>
@@ -401,7 +401,7 @@
                 <w:b w:val="0"/>
                 <w:sz w:val="19"/>
               </w:rPr>
-              <w:t>147 523 DH (programme) — 267 523 DH mobilisés au total</w:t>
+              <w:t>147 523 DH (15 % du programme)</w:t>
             </w:r>
           </w:p>
         </w:tc>
@@ -459,7 +459,7 @@
                 <w:b w:val="0"/>
                 <w:sz w:val="19"/>
               </w:rPr>
-              <w:t>491 743 DH</w:t>
+              <w:t>611 743 DH (491 743 programme + 120 000 BFR)</w:t>
             </w:r>
           </w:p>
         </w:tc>
@@ -1258,7 +1258,7 @@
                 <w:b w:val="0"/>
                 <w:sz w:val="19"/>
               </w:rPr>
-              <w:t>Investissement global 983 486 DH. Financement : fonds propres + CCA 147 523 DH, CMT bancaire 491 743 DH, prime GO SIYAHA sollicitée 344 220 DH.</w:t>
+              <w:t>Coût global du projet 1 103 486 DH (programme d’investissement 983 486 + BFR/trésorerie 120 000). Financement : fonds propres + CCA 147 523 DH, CMT bancaire 611 743 DH, prime GO SIYAHA sollicitée 344 220 DH.</w:t>
             </w:r>
           </w:p>
         </w:tc>
@@ -3892,7 +3892,7 @@
                 <w:color w:val="1B3A28"/>
                 <w:sz w:val="19"/>
               </w:rPr>
-              <w:t>Total projet</w:t>
+              <w:t>Programme d’investissement (base de la prime)</w:t>
             </w:r>
           </w:p>
         </w:tc>
@@ -3934,6 +3934,264 @@
                 <w:sz w:val="19"/>
               </w:rPr>
               <w:t>983 486</w:t>
+            </w:r>
+          </w:p>
+        </w:tc>
+      </w:tr>
+    </w:tbl>
+    <w:p>
+      <w:pPr>
+        <w:spacing w:after="40"/>
+      </w:pPr>
+    </w:p>
+    <w:tbl>
+      <w:tblPr>
+        <w:tblStyle w:val="TableGrid"/>
+        <w:tblW w:type="auto" w:w="0"/>
+        <w:jc w:val="center"/>
+        <w:tblLook w:firstColumn="1" w:firstRow="1" w:lastColumn="0" w:lastRow="0" w:noHBand="0" w:noVBand="1" w:val="04A0"/>
+      </w:tblPr>
+      <w:tblGrid>
+        <w:gridCol w:w="3400"/>
+        <w:gridCol w:w="3400"/>
+        <w:gridCol w:w="3400"/>
+      </w:tblGrid>
+      <w:tr>
+        <w:tc>
+          <w:tcPr>
+            <w:tcW w:type="dxa" w:w="2154"/>
+            <w:shd w:val="clear" w:fill="1B3A28"/>
+          </w:tcPr>
+          <w:p>
+            <w:pPr>
+              <w:spacing w:after="20" w:before="20"/>
+            </w:pPr>
+            <w:r/>
+            <w:r>
+              <w:rPr>
+                <w:b/>
+                <w:color w:val="FFFFFF"/>
+                <w:sz w:val="19"/>
+              </w:rPr>
+              <w:t>Coût global du projet</w:t>
+            </w:r>
+          </w:p>
+        </w:tc>
+        <w:tc>
+          <w:tcPr>
+            <w:tcW w:type="dxa" w:w="5386"/>
+            <w:shd w:val="clear" w:fill="1B3A28"/>
+          </w:tcPr>
+          <w:p>
+            <w:pPr>
+              <w:spacing w:after="20" w:before="20"/>
+              <w:jc w:val="center"/>
+            </w:pPr>
+            <w:r/>
+            <w:r>
+              <w:rPr>
+                <w:b/>
+                <w:color w:val="FFFFFF"/>
+                <w:sz w:val="19"/>
+              </w:rPr>
+            </w:r>
+          </w:p>
+        </w:tc>
+        <w:tc>
+          <w:tcPr>
+            <w:tcW w:type="dxa" w:w="1814"/>
+            <w:shd w:val="clear" w:fill="1B3A28"/>
+          </w:tcPr>
+          <w:p>
+            <w:pPr>
+              <w:spacing w:after="20" w:before="20"/>
+              <w:jc w:val="center"/>
+            </w:pPr>
+            <w:r/>
+            <w:r>
+              <w:rPr>
+                <w:b/>
+                <w:color w:val="FFFFFF"/>
+                <w:sz w:val="19"/>
+              </w:rPr>
+              <w:t>Montant</w:t>
+            </w:r>
+          </w:p>
+        </w:tc>
+      </w:tr>
+      <w:tr>
+        <w:tc>
+          <w:tcPr>
+            <w:tcW w:type="dxa" w:w="2154"/>
+          </w:tcPr>
+          <w:p>
+            <w:pPr>
+              <w:spacing w:after="20" w:before="20"/>
+            </w:pPr>
+            <w:r/>
+            <w:r>
+              <w:rPr>
+                <w:b/>
+                <w:sz w:val="19"/>
+              </w:rPr>
+              <w:t>Programme d’investissement</w:t>
+            </w:r>
+          </w:p>
+        </w:tc>
+        <w:tc>
+          <w:tcPr>
+            <w:tcW w:type="dxa" w:w="5386"/>
+          </w:tcPr>
+          <w:p>
+            <w:pPr>
+              <w:spacing w:after="20" w:before="20"/>
+              <w:jc w:val="center"/>
+            </w:pPr>
+            <w:r/>
+            <w:r>
+              <w:rPr>
+                <w:b w:val="0"/>
+                <w:sz w:val="19"/>
+              </w:rPr>
+            </w:r>
+          </w:p>
+        </w:tc>
+        <w:tc>
+          <w:tcPr>
+            <w:tcW w:type="dxa" w:w="1814"/>
+          </w:tcPr>
+          <w:p>
+            <w:pPr>
+              <w:spacing w:after="20" w:before="20"/>
+              <w:jc w:val="center"/>
+            </w:pPr>
+            <w:r/>
+            <w:r>
+              <w:rPr>
+                <w:b w:val="0"/>
+                <w:sz w:val="19"/>
+              </w:rPr>
+              <w:t>983 486</w:t>
+            </w:r>
+          </w:p>
+        </w:tc>
+      </w:tr>
+      <w:tr>
+        <w:tc>
+          <w:tcPr>
+            <w:tcW w:type="dxa" w:w="2154"/>
+          </w:tcPr>
+          <w:p>
+            <w:pPr>
+              <w:spacing w:after="20" w:before="20"/>
+            </w:pPr>
+            <w:r/>
+            <w:r>
+              <w:rPr>
+                <w:b/>
+                <w:sz w:val="19"/>
+              </w:rPr>
+              <w:t>Besoin en fonds de roulement / trésorerie de démarrage</w:t>
+            </w:r>
+          </w:p>
+        </w:tc>
+        <w:tc>
+          <w:tcPr>
+            <w:tcW w:type="dxa" w:w="5386"/>
+          </w:tcPr>
+          <w:p>
+            <w:pPr>
+              <w:spacing w:after="20" w:before="20"/>
+              <w:jc w:val="center"/>
+            </w:pPr>
+            <w:r/>
+            <w:r>
+              <w:rPr>
+                <w:b w:val="0"/>
+                <w:sz w:val="19"/>
+              </w:rPr>
+            </w:r>
+          </w:p>
+        </w:tc>
+        <w:tc>
+          <w:tcPr>
+            <w:tcW w:type="dxa" w:w="1814"/>
+          </w:tcPr>
+          <w:p>
+            <w:pPr>
+              <w:spacing w:after="20" w:before="20"/>
+              <w:jc w:val="center"/>
+            </w:pPr>
+            <w:r/>
+            <w:r>
+              <w:rPr>
+                <w:b w:val="0"/>
+                <w:sz w:val="19"/>
+              </w:rPr>
+              <w:t>120 000</w:t>
+            </w:r>
+          </w:p>
+        </w:tc>
+      </w:tr>
+      <w:tr>
+        <w:tc>
+          <w:tcPr>
+            <w:tcW w:type="dxa" w:w="2154"/>
+            <w:shd w:val="clear" w:fill="EFE7D6"/>
+          </w:tcPr>
+          <w:p>
+            <w:pPr>
+              <w:spacing w:after="20" w:before="20"/>
+            </w:pPr>
+            <w:r/>
+            <w:r>
+              <w:rPr>
+                <w:b/>
+                <w:color w:val="1B3A28"/>
+                <w:sz w:val="19"/>
+              </w:rPr>
+              <w:t>Coût global du projet</w:t>
+            </w:r>
+          </w:p>
+        </w:tc>
+        <w:tc>
+          <w:tcPr>
+            <w:tcW w:type="dxa" w:w="5386"/>
+            <w:shd w:val="clear" w:fill="EFE7D6"/>
+          </w:tcPr>
+          <w:p>
+            <w:pPr>
+              <w:spacing w:after="20" w:before="20"/>
+              <w:jc w:val="center"/>
+            </w:pPr>
+            <w:r/>
+            <w:r>
+              <w:rPr>
+                <w:b/>
+                <w:color w:val="1B3A28"/>
+                <w:sz w:val="19"/>
+              </w:rPr>
+            </w:r>
+          </w:p>
+        </w:tc>
+        <w:tc>
+          <w:tcPr>
+            <w:tcW w:type="dxa" w:w="1814"/>
+            <w:shd w:val="clear" w:fill="EFE7D6"/>
+          </w:tcPr>
+          <w:p>
+            <w:pPr>
+              <w:spacing w:after="20" w:before="20"/>
+              <w:jc w:val="center"/>
+            </w:pPr>
+            <w:r/>
+            <w:r>
+              <w:rPr>
+                <w:b/>
+                <w:color w:val="1B3A28"/>
+                <w:sz w:val="19"/>
+              </w:rPr>
+              <w:t>1 103 486</w:t>
             </w:r>
           </w:p>
         </w:tc>
@@ -3954,7 +4212,7 @@
           <w:i/>
           <w:sz w:val="21"/>
         </w:rPr>
-        <w:t>Le programme est présenté pour son montant global. La détermination de l’assiette primable / non primable relève exclusivement de l’appréciation de MAROC PME ; le promoteur ne préjuge pas de cette répartition.</w:t>
+        <w:t>Le coût global est présenté pour son montant total. Au sein du programme, la détermination de l’assiette primable / non primable relève exclusivement de l’appréciation de MAROC PME ; le promoteur ne préjuge pas de cette répartition.</w:t>
       </w:r>
     </w:p>
     <w:p>
@@ -3967,7 +4225,7 @@
           <w:color w:val="152E1F"/>
           <w:sz w:val="23"/>
         </w:rPr>
-        <w:t>A. Plan de financement</w:t>
+        <w:t>A. Plan de financement (coût global)</w:t>
       </w:r>
     </w:p>
     <w:tbl>
@@ -3985,7 +4243,7 @@
       <w:tr>
         <w:tc>
           <w:tcPr>
-            <w:tcW w:type="dxa" w:w="5386"/>
+            <w:tcW w:type="dxa" w:w="3685"/>
             <w:shd w:val="clear" w:fill="1B3A28"/>
           </w:tcPr>
           <w:p>
@@ -4005,7 +4263,7 @@
         </w:tc>
         <w:tc>
           <w:tcPr>
-            <w:tcW w:type="dxa" w:w="2268"/>
+            <w:tcW w:type="dxa" w:w="1814"/>
             <w:shd w:val="clear" w:fill="1B3A28"/>
           </w:tcPr>
           <w:p>
@@ -4026,7 +4284,7 @@
         </w:tc>
         <w:tc>
           <w:tcPr>
-            <w:tcW w:type="dxa" w:w="1701"/>
+            <w:tcW w:type="dxa" w:w="3855"/>
             <w:shd w:val="clear" w:fill="1B3A28"/>
           </w:tcPr>
           <w:p>
@@ -4041,7 +4299,7 @@
                 <w:color w:val="FFFFFF"/>
                 <w:sz w:val="19"/>
               </w:rPr>
-              <w:t>Part du programme</w:t>
+              <w:t>Couverture</w:t>
             </w:r>
           </w:p>
         </w:tc>
@@ -4049,7 +4307,7 @@
       <w:tr>
         <w:tc>
           <w:tcPr>
-            <w:tcW w:type="dxa" w:w="5386"/>
+            <w:tcW w:type="dxa" w:w="3685"/>
           </w:tcPr>
           <w:p>
             <w:pPr>
@@ -4067,7 +4325,7 @@
         </w:tc>
         <w:tc>
           <w:tcPr>
-            <w:tcW w:type="dxa" w:w="2268"/>
+            <w:tcW w:type="dxa" w:w="1814"/>
           </w:tcPr>
           <w:p>
             <w:pPr>
@@ -4086,7 +4344,7 @@
         </w:tc>
         <w:tc>
           <w:tcPr>
-            <w:tcW w:type="dxa" w:w="1701"/>
+            <w:tcW w:type="dxa" w:w="3855"/>
           </w:tcPr>
           <w:p>
             <w:pPr>
@@ -4099,7 +4357,7 @@
                 <w:b w:val="0"/>
                 <w:sz w:val="19"/>
               </w:rPr>
-              <w:t>15,0 %</w:t>
+              <w:t>15,0 % du programme</w:t>
             </w:r>
           </w:p>
         </w:tc>
@@ -4107,7 +4365,7 @@
       <w:tr>
         <w:tc>
           <w:tcPr>
-            <w:tcW w:type="dxa" w:w="5386"/>
+            <w:tcW w:type="dxa" w:w="3685"/>
           </w:tcPr>
           <w:p>
             <w:pPr>
@@ -4125,7 +4383,7 @@
         </w:tc>
         <w:tc>
           <w:tcPr>
-            <w:tcW w:type="dxa" w:w="2268"/>
+            <w:tcW w:type="dxa" w:w="1814"/>
           </w:tcPr>
           <w:p>
             <w:pPr>
@@ -4138,13 +4396,13 @@
                 <w:b w:val="0"/>
                 <w:sz w:val="19"/>
               </w:rPr>
-              <w:t>491 743</w:t>
-            </w:r>
-          </w:p>
-        </w:tc>
-        <w:tc>
-          <w:tcPr>
-            <w:tcW w:type="dxa" w:w="1701"/>
+              <w:t>611 743</w:t>
+            </w:r>
+          </w:p>
+        </w:tc>
+        <w:tc>
+          <w:tcPr>
+            <w:tcW w:type="dxa" w:w="3855"/>
           </w:tcPr>
           <w:p>
             <w:pPr>
@@ -4157,7 +4415,7 @@
                 <w:b w:val="0"/>
                 <w:sz w:val="19"/>
               </w:rPr>
-              <w:t>50,0 %</w:t>
+              <w:t>491 743 (50 % du programme) + 120 000 (BFR)</w:t>
             </w:r>
           </w:p>
         </w:tc>
@@ -4165,7 +4423,7 @@
       <w:tr>
         <w:tc>
           <w:tcPr>
-            <w:tcW w:type="dxa" w:w="5386"/>
+            <w:tcW w:type="dxa" w:w="3685"/>
           </w:tcPr>
           <w:p>
             <w:pPr>
@@ -4183,7 +4441,7 @@
         </w:tc>
         <w:tc>
           <w:tcPr>
-            <w:tcW w:type="dxa" w:w="2268"/>
+            <w:tcW w:type="dxa" w:w="1814"/>
           </w:tcPr>
           <w:p>
             <w:pPr>
@@ -4202,7 +4460,7 @@
         </w:tc>
         <w:tc>
           <w:tcPr>
-            <w:tcW w:type="dxa" w:w="1701"/>
+            <w:tcW w:type="dxa" w:w="3855"/>
           </w:tcPr>
           <w:p>
             <w:pPr>
@@ -4215,7 +4473,7 @@
                 <w:b w:val="0"/>
                 <w:sz w:val="19"/>
               </w:rPr>
-              <w:t>35,0 %</w:t>
+              <w:t>35,0 % du programme</w:t>
             </w:r>
           </w:p>
         </w:tc>
@@ -4223,7 +4481,7 @@
       <w:tr>
         <w:tc>
           <w:tcPr>
-            <w:tcW w:type="dxa" w:w="5386"/>
+            <w:tcW w:type="dxa" w:w="3685"/>
             <w:shd w:val="clear" w:fill="EFE7D6"/>
           </w:tcPr>
           <w:p>
@@ -4237,13 +4495,13 @@
                 <w:color w:val="1B3A28"/>
                 <w:sz w:val="19"/>
               </w:rPr>
-              <w:t>Total financement du programme</w:t>
-            </w:r>
-          </w:p>
-        </w:tc>
-        <w:tc>
-          <w:tcPr>
-            <w:tcW w:type="dxa" w:w="2268"/>
+              <w:t>Total financement (coût global)</w:t>
+            </w:r>
+          </w:p>
+        </w:tc>
+        <w:tc>
+          <w:tcPr>
+            <w:tcW w:type="dxa" w:w="1814"/>
             <w:shd w:val="clear" w:fill="EFE7D6"/>
           </w:tcPr>
           <w:p>
@@ -4258,13 +4516,13 @@
                 <w:color w:val="1B3A28"/>
                 <w:sz w:val="19"/>
               </w:rPr>
-              <w:t>983 486</w:t>
-            </w:r>
-          </w:p>
-        </w:tc>
-        <w:tc>
-          <w:tcPr>
-            <w:tcW w:type="dxa" w:w="1701"/>
+              <w:t>1 103 486</w:t>
+            </w:r>
+          </w:p>
+        </w:tc>
+        <w:tc>
+          <w:tcPr>
+            <w:tcW w:type="dxa" w:w="3855"/>
             <w:shd w:val="clear" w:fill="EFE7D6"/>
           </w:tcPr>
           <w:p>
@@ -4300,7 +4558,7 @@
           <w:i/>
           <w:sz w:val="21"/>
         </w:rPr>
-        <w:t>Fonds propres réellement mobilisés par le promoteur (programme + besoin en fonds de roulement et trésorerie de démarrage) : 267 523 DH (capital 20 000 + comptes courants d’associés 247 523). Le promoteur apporte ainsi des fonds propres au-delà de la quote-part du programme.</w:t>
+        <w:t>Le CMT finance le programme dans la limite du plafond GO SIYAHA (50 % de 983 486 = 491 743) ; la fraction complémentaire (120 000) finance le besoin en fonds de roulement, hors champ du plafond. L’apport en fonds propres reste à 15 % du programme, conformément au minimum exigé.</w:t>
       </w:r>
     </w:p>
     <w:p>
@@ -7827,7 +8085,7 @@
           <w:i w:val="0"/>
           <w:sz w:val="21"/>
         </w:rPr>
-        <w:t>Sur le plan financier, le projet repose sur un investissement global de 983 486 DH, financé par fonds propres, CMT et prime GO SIYAHA sollicitée. Les hypothèses de fréquentation restent prudentes (taux d’occupation 18 % → 38 %), et la capacité d’autofinancement permet d’honorer le service de la dette avec une marge de sécurité confortable, le décalage de la dernière tranche de prime étant neutralisé par un crédit fournisseur à coût nul.</w:t>
+        <w:t>Sur le plan financier, le projet repose sur un coût global de 1 103 486 DH (dont programme d’investissement 983 486 DH), financé par fonds propres, CMT et prime GO SIYAHA sollicitée. Les hypothèses de fréquentation restent prudentes (taux d’occupation 18 % → 38 %), et la capacité d’autofinancement permet d’honorer le service de la dette avec une marge de sécurité confortable, le décalage de la dernière tranche de prime étant neutralisé par un crédit fournisseur à coût nul.</w:t>
       </w:r>
     </w:p>
     <w:p>

</xml_diff>

<commit_message>
BP: tableau d'investissement totalise 1 103 486 (coût global, vue banque) avec sous-total programme 983 486 (base prime)
Co-Authored-By: Claude Opus 4.8 <noreply@anthropic.com>
Claude-Session: https://claude.ai/code/session_01TuoVA1diyL6DwFpHFRPjqd
</commit_message>
<xml_diff>
--- a/DA21_Business_Plan_15ebikes_VF.docx
+++ b/DA21_Business_Plan_15ebikes_VF.docx
@@ -3506,7 +3506,7 @@
           <w:color w:val="152E1F"/>
           <w:sz w:val="23"/>
         </w:rPr>
-        <w:t>Programme d’investissement (en DH TTC)</w:t>
+        <w:t>Plan d’investissement du projet (en DH TTC)</w:t>
       </w:r>
     </w:p>
     <w:tbl>
@@ -3892,7 +3892,7 @@
                 <w:color w:val="1B3A28"/>
                 <w:sz w:val="19"/>
               </w:rPr>
-              <w:t>Programme d’investissement (base de la prime)</w:t>
+              <w:t>Sous-total — programme d’investissement (base de la prime)</w:t>
             </w:r>
           </w:p>
         </w:tc>
@@ -3938,29 +3938,10 @@
           </w:p>
         </w:tc>
       </w:tr>
-    </w:tbl>
-    <w:p>
-      <w:pPr>
-        <w:spacing w:after="40"/>
-      </w:pPr>
-    </w:p>
-    <w:tbl>
-      <w:tblPr>
-        <w:tblStyle w:val="TableGrid"/>
-        <w:tblW w:type="auto" w:w="0"/>
-        <w:jc w:val="center"/>
-        <w:tblLook w:firstColumn="1" w:firstRow="1" w:lastColumn="0" w:lastRow="0" w:noHBand="0" w:noVBand="1" w:val="04A0"/>
-      </w:tblPr>
-      <w:tblGrid>
-        <w:gridCol w:w="3400"/>
-        <w:gridCol w:w="3400"/>
-        <w:gridCol w:w="3400"/>
-      </w:tblGrid>
       <w:tr>
         <w:tc>
           <w:tcPr>
             <w:tcW w:type="dxa" w:w="2154"/>
-            <w:shd w:val="clear" w:fill="1B3A28"/>
           </w:tcPr>
           <w:p>
             <w:pPr>
@@ -3970,17 +3951,15 @@
             <w:r>
               <w:rPr>
                 <w:b/>
-                <w:color w:val="FFFFFF"/>
-                <w:sz w:val="19"/>
-              </w:rPr>
-              <w:t>Coût global du projet</w:t>
+                <w:sz w:val="19"/>
+              </w:rPr>
+              <w:t>Besoin en fonds de roulement / trésorerie de démarrage</w:t>
             </w:r>
           </w:p>
         </w:tc>
         <w:tc>
           <w:tcPr>
             <w:tcW w:type="dxa" w:w="5386"/>
-            <w:shd w:val="clear" w:fill="1B3A28"/>
           </w:tcPr>
           <w:p>
             <w:pPr>
@@ -3990,17 +3969,16 @@
             <w:r/>
             <w:r>
               <w:rPr>
-                <w:b/>
-                <w:color w:val="FFFFFF"/>
-                <w:sz w:val="19"/>
-              </w:rPr>
+                <w:b w:val="0"/>
+                <w:sz w:val="19"/>
+              </w:rPr>
+              <w:t>Stock initial, consommables, communication de lancement, trésorerie de sécurité</w:t>
             </w:r>
           </w:p>
         </w:tc>
         <w:tc>
           <w:tcPr>
             <w:tcW w:type="dxa" w:w="1814"/>
-            <w:shd w:val="clear" w:fill="1B3A28"/>
           </w:tcPr>
           <w:p>
             <w:pPr>
@@ -4010,11 +3988,10 @@
             <w:r/>
             <w:r>
               <w:rPr>
-                <w:b/>
-                <w:color w:val="FFFFFF"/>
-                <w:sz w:val="19"/>
-              </w:rPr>
-              <w:t>Montant</w:t>
+                <w:b w:val="0"/>
+                <w:sz w:val="19"/>
+              </w:rPr>
+              <w:t>120 000</w:t>
             </w:r>
           </w:p>
         </w:tc>
@@ -4023,120 +4000,6 @@
         <w:tc>
           <w:tcPr>
             <w:tcW w:type="dxa" w:w="2154"/>
-          </w:tcPr>
-          <w:p>
-            <w:pPr>
-              <w:spacing w:after="20" w:before="20"/>
-            </w:pPr>
-            <w:r/>
-            <w:r>
-              <w:rPr>
-                <w:b/>
-                <w:sz w:val="19"/>
-              </w:rPr>
-              <w:t>Programme d’investissement</w:t>
-            </w:r>
-          </w:p>
-        </w:tc>
-        <w:tc>
-          <w:tcPr>
-            <w:tcW w:type="dxa" w:w="5386"/>
-          </w:tcPr>
-          <w:p>
-            <w:pPr>
-              <w:spacing w:after="20" w:before="20"/>
-              <w:jc w:val="center"/>
-            </w:pPr>
-            <w:r/>
-            <w:r>
-              <w:rPr>
-                <w:b w:val="0"/>
-                <w:sz w:val="19"/>
-              </w:rPr>
-            </w:r>
-          </w:p>
-        </w:tc>
-        <w:tc>
-          <w:tcPr>
-            <w:tcW w:type="dxa" w:w="1814"/>
-          </w:tcPr>
-          <w:p>
-            <w:pPr>
-              <w:spacing w:after="20" w:before="20"/>
-              <w:jc w:val="center"/>
-            </w:pPr>
-            <w:r/>
-            <w:r>
-              <w:rPr>
-                <w:b w:val="0"/>
-                <w:sz w:val="19"/>
-              </w:rPr>
-              <w:t>983 486</w:t>
-            </w:r>
-          </w:p>
-        </w:tc>
-      </w:tr>
-      <w:tr>
-        <w:tc>
-          <w:tcPr>
-            <w:tcW w:type="dxa" w:w="2154"/>
-          </w:tcPr>
-          <w:p>
-            <w:pPr>
-              <w:spacing w:after="20" w:before="20"/>
-            </w:pPr>
-            <w:r/>
-            <w:r>
-              <w:rPr>
-                <w:b/>
-                <w:sz w:val="19"/>
-              </w:rPr>
-              <w:t>Besoin en fonds de roulement / trésorerie de démarrage</w:t>
-            </w:r>
-          </w:p>
-        </w:tc>
-        <w:tc>
-          <w:tcPr>
-            <w:tcW w:type="dxa" w:w="5386"/>
-          </w:tcPr>
-          <w:p>
-            <w:pPr>
-              <w:spacing w:after="20" w:before="20"/>
-              <w:jc w:val="center"/>
-            </w:pPr>
-            <w:r/>
-            <w:r>
-              <w:rPr>
-                <w:b w:val="0"/>
-                <w:sz w:val="19"/>
-              </w:rPr>
-            </w:r>
-          </w:p>
-        </w:tc>
-        <w:tc>
-          <w:tcPr>
-            <w:tcW w:type="dxa" w:w="1814"/>
-          </w:tcPr>
-          <w:p>
-            <w:pPr>
-              <w:spacing w:after="20" w:before="20"/>
-              <w:jc w:val="center"/>
-            </w:pPr>
-            <w:r/>
-            <w:r>
-              <w:rPr>
-                <w:b w:val="0"/>
-                <w:sz w:val="19"/>
-              </w:rPr>
-              <w:t>120 000</w:t>
-            </w:r>
-          </w:p>
-        </w:tc>
-      </w:tr>
-      <w:tr>
-        <w:tc>
-          <w:tcPr>
-            <w:tcW w:type="dxa" w:w="2154"/>
             <w:shd w:val="clear" w:fill="EFE7D6"/>
           </w:tcPr>
           <w:p>
@@ -4150,7 +4013,7 @@
                 <w:color w:val="1B3A28"/>
                 <w:sz w:val="19"/>
               </w:rPr>
-              <w:t>Coût global du projet</w:t>
+              <w:t>Total du plan d’investissement (coût global du projet)</w:t>
             </w:r>
           </w:p>
         </w:tc>
@@ -4212,7 +4075,7 @@
           <w:i/>
           <w:sz w:val="21"/>
         </w:rPr>
-        <w:t>Le coût global est présenté pour son montant total. Au sein du programme, la détermination de l’assiette primable / non primable relève exclusivement de l’appréciation de MAROC PME ; le promoteur ne préjuge pas de cette répartition.</w:t>
+        <w:t>Le plan est présenté pour son coût global (1 103 486 DH), besoin en fonds de roulement inclus, afin de refléter le besoin de financement total soumis au partenaire bancaire. Le sous-total « programme d’investissement » (983 486 DH) constitue la base de calcul de la prime ; au sein de ce programme, la détermination de l’assiette primable / non primable relève exclusivement de l’appréciation de MAROC PME.</w:t>
       </w:r>
     </w:p>
     <w:p>

</xml_diff>

<commit_message>
BP: retour au programme 983 486 (FP 147 523 / CMT 491 743 / prime 344 220), crédit fournisseur en pont temporaire (abandon montage B / 120k / 1 103 486)
Co-Authored-By: Claude Opus 4.8 <noreply@anthropic.com>
Claude-Session: https://claude.ai/code/session_01TuoVA1diyL6DwFpHFRPjqd
</commit_message>
<xml_diff>
--- a/DA21_Business_Plan_15ebikes_VF.docx
+++ b/DA21_Business_Plan_15ebikes_VF.docx
@@ -96,7 +96,7 @@
           <w:i w:val="0"/>
           <w:sz w:val="21"/>
         </w:rPr>
-        <w:t>Ce document fournit (1) un prompt prêt à coller pour actualiser le BP graphique existant (version 10 e-bikes) sans en modifier les textes, la structure ni les couleurs, et (2) la version intégrale et exhaustive du BP recalée sur le dossier Excel VF et le DAP (scénario 15 e-bikes, coût global du projet 1 103 486 DH dont programme d’investissement 983 486 DH).</w:t>
+        <w:t>Ce document fournit (1) un prompt prêt à coller pour actualiser le BP graphique existant (version 10 e-bikes) sans en modifier les textes, la structure ni les couleurs, et (2) la version intégrale et exhaustive du BP recalée sur le dossier Excel VF et le DAP (scénario 15 e-bikes, programme d’investissement 983 486 DH ; le décalage de la dernière tranche de prime est couvert par un crédit fournisseur en pont, remboursé par la prime).</w:t>
       </w:r>
     </w:p>
     <w:p>
@@ -136,7 +136,7 @@
                 <w:color w:val="152E1F"/>
                 <w:sz w:val="20"/>
               </w:rPr>
-              <w:t>« Mets à jour le business plan DA21 ci-joint en ne changeant QUE les chiffres, sans toucher à la mise en page, à la structure des sections, aux couleurs, ni aux textes — sauf lorsqu’une phrase cite un chiffre modifié (ex. « 10 vélos », un montant d’investissement, de CA ou de financement) : dans ce cas, mets le texte en cohérence avec le nouveau chiffre, et rien de plus. Applique strictement le tableau de correspondance ancien → nouveau ci-dessous. Présente le total du projet pour son montant global, SANS répartir toi-même entre partie primable et non primable (l’assiette primable sera arrêtée par MAROC PME). Positionne la piscine comme un équipement de soutien qui fait prospérer les autres activités. Corrige deux coquilles : « Karim ZOUBDANE » (et non ZOUDANE) et la forme « DA21 SARL AU ». Conserve à l’identique tout le reste. »</w:t>
+              <w:t>« Mets à jour le business plan DA21 ci-joint en ne changeant QUE les chiffres, sans toucher à la mise en page, à la structure des sections, aux couleurs, ni aux textes — sauf lorsqu’une phrase cite un chiffre modifié (ex. « 10 vélos », un montant d’investissement, de CA ou de financement) : dans ce cas, mets le texte en cohérence avec le nouveau chiffre, et rien de plus. Applique strictement le tableau de correspondance ancien → nouveau ci-dessous. Le total du programme d’investissement est de 983 486 DH (il ne baisse pas) ; SANS répartir toi-même entre partie primable et non primable (l’assiette primable sera arrêtée par MAROC PME). Le décalage de la dernière tranche de prime est couvert par un crédit fournisseur présenté comme un PONT temporaire (il ne s’ajoute pas au financement permanent : CMT, fonds propres et prime restent inchangés). Positionne la piscine comme un équipement de soutien qui fait prospérer les autres activités. Corrige deux coquilles : « Karim ZOUBDANE » (et non ZOUDANE) et la forme « DA21 SARL AU ». Conserve à l’identique tout le reste. »</w:t>
             </w:r>
           </w:p>
         </w:tc>
@@ -305,7 +305,7 @@
                 <w:b/>
                 <w:sz w:val="19"/>
               </w:rPr>
-              <w:t>Coût global du projet</w:t>
+              <w:t>Investissement total (programme)</w:t>
             </w:r>
           </w:p>
         </w:tc>
@@ -343,7 +343,7 @@
                 <w:b w:val="0"/>
                 <w:sz w:val="19"/>
               </w:rPr>
-              <w:t>1 103 486 DH (programme 983 486 + BFR 120 000)</w:t>
+              <w:t>983 486 DH</w:t>
             </w:r>
           </w:p>
         </w:tc>
@@ -401,7 +401,7 @@
                 <w:b w:val="0"/>
                 <w:sz w:val="19"/>
               </w:rPr>
-              <w:t>147 523 DH (15 % du programme)</w:t>
+              <w:t>147 523 DH (15 %)</w:t>
             </w:r>
           </w:p>
         </w:tc>
@@ -459,7 +459,7 @@
                 <w:b w:val="0"/>
                 <w:sz w:val="19"/>
               </w:rPr>
-              <w:t>611 743 DH (491 743 programme + 120 000 BFR)</w:t>
+              <w:t>491 743 DH (50 %)</w:t>
             </w:r>
           </w:p>
         </w:tc>
@@ -1258,7 +1258,7 @@
                 <w:b w:val="0"/>
                 <w:sz w:val="19"/>
               </w:rPr>
-              <w:t>Coût global du projet 1 103 486 DH (programme d’investissement 983 486 + BFR/trésorerie 120 000). Financement : fonds propres + CCA 147 523 DH, CMT bancaire 611 743 DH, prime GO SIYAHA sollicitée 344 220 DH.</w:t>
+              <w:t>Investissement total 983 486 DH. Financement : fonds propres + CCA 147 523 DH (15 %), CMT bancaire 491 743 DH (50 %), prime GO SIYAHA sollicitée 344 220 DH (35 %). Le décalage de la dernière tranche de prime est couvert par un crédit fournisseur (pont temporaire, remboursé par la prime).</w:t>
             </w:r>
           </w:p>
         </w:tc>
@@ -3892,7 +3892,7 @@
                 <w:color w:val="1B3A28"/>
                 <w:sz w:val="19"/>
               </w:rPr>
-              <w:t>Sous-total — programme d’investissement (base de la prime)</w:t>
+              <w:t>Total du programme d’investissement</w:t>
             </w:r>
           </w:p>
         </w:tc>
@@ -3934,127 +3934,6 @@
                 <w:sz w:val="19"/>
               </w:rPr>
               <w:t>983 486</w:t>
-            </w:r>
-          </w:p>
-        </w:tc>
-      </w:tr>
-      <w:tr>
-        <w:tc>
-          <w:tcPr>
-            <w:tcW w:type="dxa" w:w="2154"/>
-          </w:tcPr>
-          <w:p>
-            <w:pPr>
-              <w:spacing w:after="20" w:before="20"/>
-            </w:pPr>
-            <w:r/>
-            <w:r>
-              <w:rPr>
-                <w:b/>
-                <w:sz w:val="19"/>
-              </w:rPr>
-              <w:t>Besoin en fonds de roulement / trésorerie de démarrage</w:t>
-            </w:r>
-          </w:p>
-        </w:tc>
-        <w:tc>
-          <w:tcPr>
-            <w:tcW w:type="dxa" w:w="5386"/>
-          </w:tcPr>
-          <w:p>
-            <w:pPr>
-              <w:spacing w:after="20" w:before="20"/>
-              <w:jc w:val="center"/>
-            </w:pPr>
-            <w:r/>
-            <w:r>
-              <w:rPr>
-                <w:b w:val="0"/>
-                <w:sz w:val="19"/>
-              </w:rPr>
-              <w:t>Stock initial, consommables, communication de lancement, trésorerie de sécurité</w:t>
-            </w:r>
-          </w:p>
-        </w:tc>
-        <w:tc>
-          <w:tcPr>
-            <w:tcW w:type="dxa" w:w="1814"/>
-          </w:tcPr>
-          <w:p>
-            <w:pPr>
-              <w:spacing w:after="20" w:before="20"/>
-              <w:jc w:val="center"/>
-            </w:pPr>
-            <w:r/>
-            <w:r>
-              <w:rPr>
-                <w:b w:val="0"/>
-                <w:sz w:val="19"/>
-              </w:rPr>
-              <w:t>120 000</w:t>
-            </w:r>
-          </w:p>
-        </w:tc>
-      </w:tr>
-      <w:tr>
-        <w:tc>
-          <w:tcPr>
-            <w:tcW w:type="dxa" w:w="2154"/>
-            <w:shd w:val="clear" w:fill="EFE7D6"/>
-          </w:tcPr>
-          <w:p>
-            <w:pPr>
-              <w:spacing w:after="20" w:before="20"/>
-            </w:pPr>
-            <w:r/>
-            <w:r>
-              <w:rPr>
-                <w:b/>
-                <w:color w:val="1B3A28"/>
-                <w:sz w:val="19"/>
-              </w:rPr>
-              <w:t>Total du plan d’investissement (coût global du projet)</w:t>
-            </w:r>
-          </w:p>
-        </w:tc>
-        <w:tc>
-          <w:tcPr>
-            <w:tcW w:type="dxa" w:w="5386"/>
-            <w:shd w:val="clear" w:fill="EFE7D6"/>
-          </w:tcPr>
-          <w:p>
-            <w:pPr>
-              <w:spacing w:after="20" w:before="20"/>
-              <w:jc w:val="center"/>
-            </w:pPr>
-            <w:r/>
-            <w:r>
-              <w:rPr>
-                <w:b/>
-                <w:color w:val="1B3A28"/>
-                <w:sz w:val="19"/>
-              </w:rPr>
-            </w:r>
-          </w:p>
-        </w:tc>
-        <w:tc>
-          <w:tcPr>
-            <w:tcW w:type="dxa" w:w="1814"/>
-            <w:shd w:val="clear" w:fill="EFE7D6"/>
-          </w:tcPr>
-          <w:p>
-            <w:pPr>
-              <w:spacing w:after="20" w:before="20"/>
-              <w:jc w:val="center"/>
-            </w:pPr>
-            <w:r/>
-            <w:r>
-              <w:rPr>
-                <w:b/>
-                <w:color w:val="1B3A28"/>
-                <w:sz w:val="19"/>
-              </w:rPr>
-              <w:t>1 103 486</w:t>
             </w:r>
           </w:p>
         </w:tc>
@@ -4075,7 +3954,7 @@
           <w:i/>
           <w:sz w:val="21"/>
         </w:rPr>
-        <w:t>Le plan est présenté pour son coût global (1 103 486 DH), besoin en fonds de roulement inclus, afin de refléter le besoin de financement total soumis au partenaire bancaire. Le sous-total « programme d’investissement » (983 486 DH) constitue la base de calcul de la prime ; au sein de ce programme, la détermination de l’assiette primable / non primable relève exclusivement de l’appréciation de MAROC PME.</w:t>
+        <w:t>Le programme d’investissement totalise 983 486 DH. Au sein de ce programme, la détermination de l’assiette primable / non primable relève exclusivement de l’appréciation de MAROC PME ; le promoteur ne préjuge pas de cette répartition.</w:t>
       </w:r>
     </w:p>
     <w:p>
@@ -4088,7 +3967,7 @@
           <w:color w:val="152E1F"/>
           <w:sz w:val="23"/>
         </w:rPr>
-        <w:t>A. Plan de financement (coût global)</w:t>
+        <w:t>A. Plan de financement</w:t>
       </w:r>
     </w:p>
     <w:tbl>
@@ -4162,7 +4041,7 @@
                 <w:color w:val="FFFFFF"/>
                 <w:sz w:val="19"/>
               </w:rPr>
-              <w:t>Couverture</w:t>
+              <w:t>Part</w:t>
             </w:r>
           </w:p>
         </w:tc>
@@ -4220,7 +4099,7 @@
                 <w:b w:val="0"/>
                 <w:sz w:val="19"/>
               </w:rPr>
-              <w:t>15,0 % du programme</w:t>
+              <w:t>15,0 %</w:t>
             </w:r>
           </w:p>
         </w:tc>
@@ -4259,7 +4138,7 @@
                 <w:b w:val="0"/>
                 <w:sz w:val="19"/>
               </w:rPr>
-              <w:t>611 743</w:t>
+              <w:t>491 743</w:t>
             </w:r>
           </w:p>
         </w:tc>
@@ -4278,7 +4157,7 @@
                 <w:b w:val="0"/>
                 <w:sz w:val="19"/>
               </w:rPr>
-              <w:t>491 743 (50 % du programme) + 120 000 (BFR)</w:t>
+              <w:t>50,0 %</w:t>
             </w:r>
           </w:p>
         </w:tc>
@@ -4336,7 +4215,7 @@
                 <w:b w:val="0"/>
                 <w:sz w:val="19"/>
               </w:rPr>
-              <w:t>35,0 % du programme</w:t>
+              <w:t>35,0 %</w:t>
             </w:r>
           </w:p>
         </w:tc>
@@ -4358,7 +4237,7 @@
                 <w:color w:val="1B3A28"/>
                 <w:sz w:val="19"/>
               </w:rPr>
-              <w:t>Total financement (coût global)</w:t>
+              <w:t>Total financement du programme</w:t>
             </w:r>
           </w:p>
         </w:tc>
@@ -4379,7 +4258,7 @@
                 <w:color w:val="1B3A28"/>
                 <w:sz w:val="19"/>
               </w:rPr>
-              <w:t>1 103 486</w:t>
+              <w:t>983 486</w:t>
             </w:r>
           </w:p>
         </w:tc>
@@ -4421,7 +4300,7 @@
           <w:i/>
           <w:sz w:val="21"/>
         </w:rPr>
-        <w:t>Le CMT finance le programme dans la limite du plafond GO SIYAHA (50 % de 983 486 = 491 743) ; la fraction complémentaire (120 000) finance le besoin en fonds de roulement, hors champ du plafond. L’apport en fonds propres reste à 15 % du programme, conformément au minimum exigé.</w:t>
+        <w:t>Conformité GO SIYAHA : apport en fonds propres ≥ 15 % ✔ ; CMT ≤ 50 % ✔ ; prime sollicitée à 35 %. Le décalage de la dernière tranche de prime est couvert par un crédit fournisseur présenté ci-après comme un pont temporaire — il ne s’ajoute pas au financement permanent (CMT, fonds propres et prime restent inchangés).</w:t>
       </w:r>
     </w:p>
     <w:p>
@@ -7948,7 +7827,7 @@
           <w:i w:val="0"/>
           <w:sz w:val="21"/>
         </w:rPr>
-        <w:t>Sur le plan financier, le projet repose sur un coût global de 1 103 486 DH (dont programme d’investissement 983 486 DH), financé par fonds propres, CMT et prime GO SIYAHA sollicitée. Les hypothèses de fréquentation restent prudentes (taux d’occupation 18 % → 38 %), et la capacité d’autofinancement permet d’honorer le service de la dette avec une marge de sécurité confortable, le décalage de la dernière tranche de prime étant neutralisé par un crédit fournisseur à coût nul.</w:t>
+        <w:t>Sur le plan financier, le projet repose sur un programme d’investissement de 983 486 DH, financé par fonds propres, CMT et prime GO SIYAHA sollicitée. Les hypothèses de fréquentation restent prudentes (taux d’occupation 18 % → 38 %), et la capacité d’autofinancement permet d’honorer le service de la dette avec une marge de sécurité confortable, le décalage de la dernière tranche de prime étant neutralisé par un crédit fournisseur à coût nul.</w:t>
       </w:r>
     </w:p>
     <w:p>

</xml_diff>

<commit_message>
BP: coût total projet 1 103 486 (programme 983 486 + FR 120 000), crédit fournisseur = 4e source finançant le FR ; FP/CMT/prime inchangés
Co-Authored-By: Claude Opus 4.8 <noreply@anthropic.com>
Claude-Session: https://claude.ai/code/session_01TuoVA1diyL6DwFpHFRPjqd
</commit_message>
<xml_diff>
--- a/DA21_Business_Plan_15ebikes_VF.docx
+++ b/DA21_Business_Plan_15ebikes_VF.docx
@@ -96,7 +96,7 @@
           <w:i w:val="0"/>
           <w:sz w:val="21"/>
         </w:rPr>
-        <w:t>Ce document fournit (1) un prompt prêt à coller pour actualiser le BP graphique existant (version 10 e-bikes) sans en modifier les textes, la structure ni les couleurs, et (2) la version intégrale et exhaustive du BP recalée sur le dossier Excel VF et le DAP (scénario 15 e-bikes, programme d’investissement 983 486 DH ; le décalage de la dernière tranche de prime est couvert par un crédit fournisseur en pont, remboursé par la prime).</w:t>
+        <w:t>Ce document fournit (1) un prompt prêt à coller pour actualiser le BP graphique existant (version 10 e-bikes) sans en modifier les textes, la structure ni les couleurs, et (2) la version intégrale et exhaustive du BP recalée sur le dossier Excel VF et le DAP (scénario 15 e-bikes, coût total du projet 1 103 486 DH = programme d’investissement 983 486 + fonds de roulement 120 000, ce dernier financé par crédit fournisseur).</w:t>
       </w:r>
     </w:p>
     <w:p>
@@ -136,7 +136,7 @@
                 <w:color w:val="152E1F"/>
                 <w:sz w:val="20"/>
               </w:rPr>
-              <w:t>« Mets à jour le business plan DA21 ci-joint en ne changeant QUE les chiffres, sans toucher à la mise en page, à la structure des sections, aux couleurs, ni aux textes — sauf lorsqu’une phrase cite un chiffre modifié (ex. « 10 vélos », un montant d’investissement, de CA ou de financement) : dans ce cas, mets le texte en cohérence avec le nouveau chiffre, et rien de plus. Applique strictement le tableau de correspondance ancien → nouveau ci-dessous. Le total du programme d’investissement est de 983 486 DH (il ne baisse pas) ; SANS répartir toi-même entre partie primable et non primable (l’assiette primable sera arrêtée par MAROC PME). Le décalage de la dernière tranche de prime est couvert par un crédit fournisseur présenté comme un PONT temporaire (il ne s’ajoute pas au financement permanent : CMT, fonds propres et prime restent inchangés). Positionne la piscine comme un équipement de soutien qui fait prospérer les autres activités. Corrige deux coquilles : « Karim ZOUBDANE » (et non ZOUDANE) et la forme « DA21 SARL AU ». Conserve à l’identique tout le reste. »</w:t>
+              <w:t>« Mets à jour le business plan DA21 ci-joint en ne changeant QUE les chiffres, sans toucher à la mise en page, à la structure des sections, aux couleurs, ni aux textes — sauf lorsqu’une phrase cite un chiffre modifié (ex. « 10 vélos », un montant d’investissement, de CA ou de financement) : dans ce cas, mets le texte en cohérence avec le nouveau chiffre, et rien de plus. Applique strictement le tableau de correspondance ancien → nouveau ci-dessous. L’investissement total affiché est le COÛT TOTAL DU PROJET 1 103 486 DH (programme d’investissement 983 486 + fonds de roulement 120 000) ; ne détaille pas toi-même quelle part du programme est éligible (c’est MAROC PME qui le déterminera). Le fonds de roulement (120 000) est financé par le crédit fournisseur, 4e source de financement ; les fonds propres (147 523), le CMT (491 743) et la prime (344 220) restent inchangés. Positionne la piscine comme un équipement de soutien qui fait prospérer les autres activités. Corrige deux coquilles : « Karim ZOUBDANE » (et non ZOUDANE) et la forme « DA21 SARL AU ». Conserve à l’identique tout le reste. »</w:t>
             </w:r>
           </w:p>
         </w:tc>
@@ -305,7 +305,7 @@
                 <w:b/>
                 <w:sz w:val="19"/>
               </w:rPr>
-              <w:t>Investissement total (programme)</w:t>
+              <w:t>Investissement total (programme + FR)</w:t>
             </w:r>
           </w:p>
         </w:tc>
@@ -343,7 +343,7 @@
                 <w:b w:val="0"/>
                 <w:sz w:val="19"/>
               </w:rPr>
-              <w:t>983 486 DH</w:t>
+              <w:t>1 103 486 DH (programme 983 486 + FR 120 000)</w:t>
             </w:r>
           </w:p>
         </w:tc>
@@ -460,6 +460,64 @@
                 <w:sz w:val="19"/>
               </w:rPr>
               <w:t>491 743 DH (50 %)</w:t>
+            </w:r>
+          </w:p>
+        </w:tc>
+      </w:tr>
+      <w:tr>
+        <w:tc>
+          <w:tcPr>
+            <w:tcW w:type="dxa" w:w="2835"/>
+          </w:tcPr>
+          <w:p>
+            <w:pPr>
+              <w:spacing w:after="20" w:before="20"/>
+            </w:pPr>
+            <w:r/>
+            <w:r>
+              <w:rPr>
+                <w:b/>
+                <w:sz w:val="19"/>
+              </w:rPr>
+              <w:t>Crédit fournisseur (4e source, FR)</w:t>
+            </w:r>
+          </w:p>
+        </w:tc>
+        <w:tc>
+          <w:tcPr>
+            <w:tcW w:type="dxa" w:w="3005"/>
+          </w:tcPr>
+          <w:p>
+            <w:pPr>
+              <w:spacing w:after="20" w:before="20"/>
+              <w:jc w:val="center"/>
+            </w:pPr>
+            <w:r/>
+            <w:r>
+              <w:rPr>
+                <w:b w:val="0"/>
+                <w:sz w:val="19"/>
+              </w:rPr>
+              <w:t>—</w:t>
+            </w:r>
+          </w:p>
+        </w:tc>
+        <w:tc>
+          <w:tcPr>
+            <w:tcW w:type="dxa" w:w="3685"/>
+          </w:tcPr>
+          <w:p>
+            <w:pPr>
+              <w:spacing w:after="20" w:before="20"/>
+              <w:jc w:val="center"/>
+            </w:pPr>
+            <w:r/>
+            <w:r>
+              <w:rPr>
+                <w:b w:val="0"/>
+                <w:sz w:val="19"/>
+              </w:rPr>
+              <w:t>120 000 DH</w:t>
             </w:r>
           </w:p>
         </w:tc>
@@ -1258,7 +1316,7 @@
                 <w:b w:val="0"/>
                 <w:sz w:val="19"/>
               </w:rPr>
-              <w:t>Investissement total 983 486 DH. Financement : fonds propres + CCA 147 523 DH (15 %), CMT bancaire 491 743 DH (50 %), prime GO SIYAHA sollicitée 344 220 DH (35 %). Le décalage de la dernière tranche de prime est couvert par un crédit fournisseur (pont temporaire, remboursé par la prime).</w:t>
+              <w:t>Investissement total 1 103 486 DH (programme d’investissement 983 486 + fonds de roulement/trésorerie 120 000). Financement : fonds propres + CCA 147 523 (15 %), CMT 491 743 (50 %), prime GO SIYAHA sollicitée 344 220 (35 %) et crédit fournisseur 120 000. Le crédit fournisseur fait le pont sur le décalage des tranches de prime et se rembourse à mesure des encaissements.</w:t>
             </w:r>
           </w:p>
         </w:tc>
@@ -3892,7 +3950,7 @@
                 <w:color w:val="1B3A28"/>
                 <w:sz w:val="19"/>
               </w:rPr>
-              <w:t>Total du programme d’investissement</w:t>
+              <w:t>Sous-total — programme d’investissement</w:t>
             </w:r>
           </w:p>
         </w:tc>
@@ -3934,6 +3992,127 @@
                 <w:sz w:val="19"/>
               </w:rPr>
               <w:t>983 486</w:t>
+            </w:r>
+          </w:p>
+        </w:tc>
+      </w:tr>
+      <w:tr>
+        <w:tc>
+          <w:tcPr>
+            <w:tcW w:type="dxa" w:w="2154"/>
+          </w:tcPr>
+          <w:p>
+            <w:pPr>
+              <w:spacing w:after="20" w:before="20"/>
+            </w:pPr>
+            <w:r/>
+            <w:r>
+              <w:rPr>
+                <w:b/>
+                <w:sz w:val="19"/>
+              </w:rPr>
+              <w:t>Fonds de roulement / trésorerie de démarrage</w:t>
+            </w:r>
+          </w:p>
+        </w:tc>
+        <w:tc>
+          <w:tcPr>
+            <w:tcW w:type="dxa" w:w="5386"/>
+          </w:tcPr>
+          <w:p>
+            <w:pPr>
+              <w:spacing w:after="20" w:before="20"/>
+              <w:jc w:val="center"/>
+            </w:pPr>
+            <w:r/>
+            <w:r>
+              <w:rPr>
+                <w:b w:val="0"/>
+                <w:sz w:val="19"/>
+              </w:rPr>
+              <w:t>Stock initial, consommables, communication de lancement, trésorerie de sécurité</w:t>
+            </w:r>
+          </w:p>
+        </w:tc>
+        <w:tc>
+          <w:tcPr>
+            <w:tcW w:type="dxa" w:w="1814"/>
+          </w:tcPr>
+          <w:p>
+            <w:pPr>
+              <w:spacing w:after="20" w:before="20"/>
+              <w:jc w:val="center"/>
+            </w:pPr>
+            <w:r/>
+            <w:r>
+              <w:rPr>
+                <w:b w:val="0"/>
+                <w:sz w:val="19"/>
+              </w:rPr>
+              <w:t>120 000</w:t>
+            </w:r>
+          </w:p>
+        </w:tc>
+      </w:tr>
+      <w:tr>
+        <w:tc>
+          <w:tcPr>
+            <w:tcW w:type="dxa" w:w="2154"/>
+            <w:shd w:val="clear" w:fill="EFE7D6"/>
+          </w:tcPr>
+          <w:p>
+            <w:pPr>
+              <w:spacing w:after="20" w:before="20"/>
+            </w:pPr>
+            <w:r/>
+            <w:r>
+              <w:rPr>
+                <w:b/>
+                <w:color w:val="1B3A28"/>
+                <w:sz w:val="19"/>
+              </w:rPr>
+              <w:t>Total du projet</w:t>
+            </w:r>
+          </w:p>
+        </w:tc>
+        <w:tc>
+          <w:tcPr>
+            <w:tcW w:type="dxa" w:w="5386"/>
+            <w:shd w:val="clear" w:fill="EFE7D6"/>
+          </w:tcPr>
+          <w:p>
+            <w:pPr>
+              <w:spacing w:after="20" w:before="20"/>
+              <w:jc w:val="center"/>
+            </w:pPr>
+            <w:r/>
+            <w:r>
+              <w:rPr>
+                <w:b/>
+                <w:color w:val="1B3A28"/>
+                <w:sz w:val="19"/>
+              </w:rPr>
+            </w:r>
+          </w:p>
+        </w:tc>
+        <w:tc>
+          <w:tcPr>
+            <w:tcW w:type="dxa" w:w="1814"/>
+            <w:shd w:val="clear" w:fill="EFE7D6"/>
+          </w:tcPr>
+          <w:p>
+            <w:pPr>
+              <w:spacing w:after="20" w:before="20"/>
+              <w:jc w:val="center"/>
+            </w:pPr>
+            <w:r/>
+            <w:r>
+              <w:rPr>
+                <w:b/>
+                <w:color w:val="1B3A28"/>
+                <w:sz w:val="19"/>
+              </w:rPr>
+              <w:t>1 103 486</w:t>
             </w:r>
           </w:p>
         </w:tc>
@@ -3954,7 +4133,7 @@
           <w:i/>
           <w:sz w:val="21"/>
         </w:rPr>
-        <w:t>Le programme d’investissement totalise 983 486 DH. Au sein de ce programme, la détermination de l’assiette primable / non primable relève exclusivement de l’appréciation de MAROC PME ; le promoteur ne préjuge pas de cette répartition.</w:t>
+        <w:t>Le projet est présenté pour son montant total (1 103 486 DH), fonds de roulement inclus, soumis au partenaire bancaire. Le sous-total « programme d’investissement » (983 486 DH) sert de base au calcul de la prime ; au sein de ce programme, la répartition éligible relève de l’appréciation de MAROC PME.</w:t>
       </w:r>
     </w:p>
     <w:p>
@@ -3967,7 +4146,7 @@
           <w:color w:val="152E1F"/>
           <w:sz w:val="23"/>
         </w:rPr>
-        <w:t>A. Plan de financement</w:t>
+        <w:t>A. Plan de financement du projet</w:t>
       </w:r>
     </w:p>
     <w:tbl>
@@ -3985,7 +4164,7 @@
       <w:tr>
         <w:tc>
           <w:tcPr>
-            <w:tcW w:type="dxa" w:w="3685"/>
+            <w:tcW w:type="dxa" w:w="3175"/>
             <w:shd w:val="clear" w:fill="1B3A28"/>
           </w:tcPr>
           <w:p>
@@ -4005,7 +4184,7 @@
         </w:tc>
         <w:tc>
           <w:tcPr>
-            <w:tcW w:type="dxa" w:w="1814"/>
+            <w:tcW w:type="dxa" w:w="1701"/>
             <w:shd w:val="clear" w:fill="1B3A28"/>
           </w:tcPr>
           <w:p>
@@ -4026,7 +4205,7 @@
         </w:tc>
         <w:tc>
           <w:tcPr>
-            <w:tcW w:type="dxa" w:w="3855"/>
+            <w:tcW w:type="dxa" w:w="4365"/>
             <w:shd w:val="clear" w:fill="1B3A28"/>
           </w:tcPr>
           <w:p>
@@ -4041,7 +4220,7 @@
                 <w:color w:val="FFFFFF"/>
                 <w:sz w:val="19"/>
               </w:rPr>
-              <w:t>Part</w:t>
+              <w:t>Couverture</w:t>
             </w:r>
           </w:p>
         </w:tc>
@@ -4049,7 +4228,7 @@
       <w:tr>
         <w:tc>
           <w:tcPr>
-            <w:tcW w:type="dxa" w:w="3685"/>
+            <w:tcW w:type="dxa" w:w="3175"/>
           </w:tcPr>
           <w:p>
             <w:pPr>
@@ -4067,7 +4246,7 @@
         </w:tc>
         <w:tc>
           <w:tcPr>
-            <w:tcW w:type="dxa" w:w="1814"/>
+            <w:tcW w:type="dxa" w:w="1701"/>
           </w:tcPr>
           <w:p>
             <w:pPr>
@@ -4086,7 +4265,7 @@
         </w:tc>
         <w:tc>
           <w:tcPr>
-            <w:tcW w:type="dxa" w:w="3855"/>
+            <w:tcW w:type="dxa" w:w="4365"/>
           </w:tcPr>
           <w:p>
             <w:pPr>
@@ -4099,7 +4278,7 @@
                 <w:b w:val="0"/>
                 <w:sz w:val="19"/>
               </w:rPr>
-              <w:t>15,0 %</w:t>
+              <w:t>15,0 % du programme</w:t>
             </w:r>
           </w:p>
         </w:tc>
@@ -4107,7 +4286,7 @@
       <w:tr>
         <w:tc>
           <w:tcPr>
-            <w:tcW w:type="dxa" w:w="3685"/>
+            <w:tcW w:type="dxa" w:w="3175"/>
           </w:tcPr>
           <w:p>
             <w:pPr>
@@ -4125,7 +4304,7 @@
         </w:tc>
         <w:tc>
           <w:tcPr>
-            <w:tcW w:type="dxa" w:w="1814"/>
+            <w:tcW w:type="dxa" w:w="1701"/>
           </w:tcPr>
           <w:p>
             <w:pPr>
@@ -4144,7 +4323,7 @@
         </w:tc>
         <w:tc>
           <w:tcPr>
-            <w:tcW w:type="dxa" w:w="3855"/>
+            <w:tcW w:type="dxa" w:w="4365"/>
           </w:tcPr>
           <w:p>
             <w:pPr>
@@ -4157,7 +4336,7 @@
                 <w:b w:val="0"/>
                 <w:sz w:val="19"/>
               </w:rPr>
-              <w:t>50,0 %</w:t>
+              <w:t>50,0 % du programme</w:t>
             </w:r>
           </w:p>
         </w:tc>
@@ -4165,7 +4344,7 @@
       <w:tr>
         <w:tc>
           <w:tcPr>
-            <w:tcW w:type="dxa" w:w="3685"/>
+            <w:tcW w:type="dxa" w:w="3175"/>
           </w:tcPr>
           <w:p>
             <w:pPr>
@@ -4183,7 +4362,7 @@
         </w:tc>
         <w:tc>
           <w:tcPr>
-            <w:tcW w:type="dxa" w:w="1814"/>
+            <w:tcW w:type="dxa" w:w="1701"/>
           </w:tcPr>
           <w:p>
             <w:pPr>
@@ -4202,7 +4381,7 @@
         </w:tc>
         <w:tc>
           <w:tcPr>
-            <w:tcW w:type="dxa" w:w="3855"/>
+            <w:tcW w:type="dxa" w:w="4365"/>
           </w:tcPr>
           <w:p>
             <w:pPr>
@@ -4215,7 +4394,7 @@
                 <w:b w:val="0"/>
                 <w:sz w:val="19"/>
               </w:rPr>
-              <w:t>35,0 %</w:t>
+              <w:t>35,0 % du programme</w:t>
             </w:r>
           </w:p>
         </w:tc>
@@ -4223,7 +4402,65 @@
       <w:tr>
         <w:tc>
           <w:tcPr>
-            <w:tcW w:type="dxa" w:w="3685"/>
+            <w:tcW w:type="dxa" w:w="3175"/>
+          </w:tcPr>
+          <w:p>
+            <w:pPr>
+              <w:spacing w:after="20" w:before="20"/>
+            </w:pPr>
+            <w:r/>
+            <w:r>
+              <w:rPr>
+                <w:b/>
+                <w:sz w:val="19"/>
+              </w:rPr>
+              <w:t>Crédit fournisseur</w:t>
+            </w:r>
+          </w:p>
+        </w:tc>
+        <w:tc>
+          <w:tcPr>
+            <w:tcW w:type="dxa" w:w="1701"/>
+          </w:tcPr>
+          <w:p>
+            <w:pPr>
+              <w:spacing w:after="20" w:before="20"/>
+              <w:jc w:val="center"/>
+            </w:pPr>
+            <w:r/>
+            <w:r>
+              <w:rPr>
+                <w:b w:val="0"/>
+                <w:sz w:val="19"/>
+              </w:rPr>
+              <w:t>120 000</w:t>
+            </w:r>
+          </w:p>
+        </w:tc>
+        <w:tc>
+          <w:tcPr>
+            <w:tcW w:type="dxa" w:w="4365"/>
+          </w:tcPr>
+          <w:p>
+            <w:pPr>
+              <w:spacing w:after="20" w:before="20"/>
+              <w:jc w:val="center"/>
+            </w:pPr>
+            <w:r/>
+            <w:r>
+              <w:rPr>
+                <w:b w:val="0"/>
+                <w:sz w:val="19"/>
+              </w:rPr>
+              <w:t>finance le fonds de roulement / pont des tranches de prime</w:t>
+            </w:r>
+          </w:p>
+        </w:tc>
+      </w:tr>
+      <w:tr>
+        <w:tc>
+          <w:tcPr>
+            <w:tcW w:type="dxa" w:w="3175"/>
             <w:shd w:val="clear" w:fill="EFE7D6"/>
           </w:tcPr>
           <w:p>
@@ -4237,13 +4474,13 @@
                 <w:color w:val="1B3A28"/>
                 <w:sz w:val="19"/>
               </w:rPr>
-              <w:t>Total financement du programme</w:t>
-            </w:r>
-          </w:p>
-        </w:tc>
-        <w:tc>
-          <w:tcPr>
-            <w:tcW w:type="dxa" w:w="1814"/>
+              <w:t>Total financement du projet</w:t>
+            </w:r>
+          </w:p>
+        </w:tc>
+        <w:tc>
+          <w:tcPr>
+            <w:tcW w:type="dxa" w:w="1701"/>
             <w:shd w:val="clear" w:fill="EFE7D6"/>
           </w:tcPr>
           <w:p>
@@ -4258,13 +4495,13 @@
                 <w:color w:val="1B3A28"/>
                 <w:sz w:val="19"/>
               </w:rPr>
-              <w:t>983 486</w:t>
-            </w:r>
-          </w:p>
-        </w:tc>
-        <w:tc>
-          <w:tcPr>
-            <w:tcW w:type="dxa" w:w="3855"/>
+              <w:t>1 103 486</w:t>
+            </w:r>
+          </w:p>
+        </w:tc>
+        <w:tc>
+          <w:tcPr>
+            <w:tcW w:type="dxa" w:w="4365"/>
             <w:shd w:val="clear" w:fill="EFE7D6"/>
           </w:tcPr>
           <w:p>
@@ -4300,7 +4537,7 @@
           <w:i/>
           <w:sz w:val="21"/>
         </w:rPr>
-        <w:t>Conformité GO SIYAHA : apport en fonds propres ≥ 15 % ✔ ; CMT ≤ 50 % ✔ ; prime sollicitée à 35 %. Le décalage de la dernière tranche de prime est couvert par un crédit fournisseur présenté ci-après comme un pont temporaire — il ne s’ajoute pas au financement permanent (CMT, fonds propres et prime restent inchangés).</w:t>
+        <w:t>Fonds propres, CMT et prime financent le programme d’investissement (983 486 DH) dans le respect des plafonds GO SIYAHA (apport ≥ 15 % ✔, CMT ≤ 50 % ✔, prime sollicitée à 35 %). Le crédit fournisseur (120 000 DH, négocié auprès des fournisseurs hors e-bike) finance le fonds de roulement de démarrage et fait le pont sur le décalage des tranches de prime ; il se rembourse à mesure des encaissements de prime, sans modifier le CMT, les fonds propres ni la prime.</w:t>
       </w:r>
     </w:p>
     <w:p>
@@ -4744,7 +4981,7 @@
           <w:color w:val="152E1F"/>
           <w:sz w:val="23"/>
         </w:rPr>
-        <w:t>C. Échéancier de trésorerie &amp; crédit fournisseur — zéro trou de trésorerie</w:t>
+        <w:t>C. Crédit fournisseur — zéro trou de trésorerie</w:t>
       </w:r>
     </w:p>
     <w:p>
@@ -4757,7 +4994,7 @@
           <w:i w:val="0"/>
           <w:sz w:val="21"/>
         </w:rPr>
-        <w:t>La 3ᵉ tranche de prime (137 688 DH) n’est encaissée qu’après l’achèvement, alors que les fournisseurs doivent être réglés à la livraison. Pour neutraliser ce décalage sans financement bancaire supplémentaire, les fournisseurs hors e-bike (823 001 DH de factures) accordent un crédit fournisseur — simple report de règlement, à coût nul — d’un montant égal à la dernière tranche, remboursé dès son encaissement. Le CMT (491 743) et la prime (344 220) restent inchangés.</w:t>
+        <w:t>Les tranches de prime sont encaissées progressivement (20/40/40), la dernière après l’achèvement, alors que les fournisseurs doivent être réglés à la livraison. Pour neutraliser ce décalage, les fournisseurs hors e-bike (823 001 DH de factures) accordent un crédit fournisseur de 120 000 DH — report de règlement à coût nul — remboursé à mesure des encaissements de prime. Le CMT (491 743), les fonds propres (147 523) et la prime (344 220) restent inchangés.</w:t>
       </w:r>
     </w:p>
     <w:tbl>
@@ -4873,7 +5110,7 @@
                 <w:b/>
                 <w:sz w:val="19"/>
               </w:rPr>
-              <w:t>Achèvement des travaux (3e tranche non encore reçue)</w:t>
+              <w:t>Pendant la réalisation (tranches de prime non encore reçues)</w:t>
             </w:r>
           </w:p>
         </w:tc>
@@ -4892,7 +5129,7 @@
                 <w:b w:val="0"/>
                 <w:sz w:val="19"/>
               </w:rPr>
-              <w:t>− 137 688</w:t>
+              <w:t>− 120 000</w:t>
             </w:r>
           </w:p>
         </w:tc>
@@ -4911,7 +5148,7 @@
                 <w:b w:val="0"/>
                 <w:sz w:val="19"/>
               </w:rPr>
-              <w:t>+ 137 688 (report de règlement)</w:t>
+              <w:t>+ 120 000 (report de règlement)</w:t>
             </w:r>
           </w:p>
         </w:tc>
@@ -4950,7 +5187,7 @@
                 <w:b/>
                 <w:sz w:val="19"/>
               </w:rPr>
-              <w:t>Réception de la 3e tranche GO SIYAHA</w:t>
+              <w:t>Au fil du déblocage des tranches de prime</w:t>
             </w:r>
           </w:p>
         </w:tc>
@@ -4969,7 +5206,7 @@
                 <w:b w:val="0"/>
                 <w:sz w:val="19"/>
               </w:rPr>
-              <w:t>+ 137 688</w:t>
+              <w:t>+ 120 000</w:t>
             </w:r>
           </w:p>
         </w:tc>
@@ -4988,7 +5225,7 @@
                 <w:b w:val="0"/>
                 <w:sz w:val="19"/>
               </w:rPr>
-              <w:t>− 137 688 (règlement des fournisseurs)</w:t>
+              <w:t>− 120 000 (règlement des fournisseurs)</w:t>
             </w:r>
           </w:p>
         </w:tc>
@@ -5028,7 +5265,7 @@
           <w:i/>
           <w:sz w:val="21"/>
         </w:rPr>
-        <w:t>Le pool de fournisseurs concernés (construction, paintball, aménagement, cuisine, solaire, architecte) représente 823 001 DH ; différer 137 688 DH n’en mobilise que ~17 %, adossé à une créance certaine sur MAROC PME. En cas de retard également sur la 2ᵉ tranche, le pont peut être étendu à 275 376 DH, toujours couvert par ce pool.</w:t>
+        <w:t>Le pool de fournisseurs concernés (construction, paintball, aménagement, cuisine, solaire, architecte) représente 823 001 DH ; différer 120 000 DH n’en mobilise que ~15 %, adossé à une créance certaine sur MAROC PME (les tranches de prime restant à débloquer).</w:t>
       </w:r>
     </w:p>
     <w:p>
@@ -7827,7 +8064,7 @@
           <w:i w:val="0"/>
           <w:sz w:val="21"/>
         </w:rPr>
-        <w:t>Sur le plan financier, le projet repose sur un programme d’investissement de 983 486 DH, financé par fonds propres, CMT et prime GO SIYAHA sollicitée. Les hypothèses de fréquentation restent prudentes (taux d’occupation 18 % → 38 %), et la capacité d’autofinancement permet d’honorer le service de la dette avec une marge de sécurité confortable, le décalage de la dernière tranche de prime étant neutralisé par un crédit fournisseur à coût nul.</w:t>
+        <w:t>Sur le plan financier, le projet représente un coût total de 1 103 486 DH (programme d’investissement 983 486 + fonds de roulement 120 000), financé par fonds propres, CMT, prime GO SIYAHA sollicitée et crédit fournisseur. Les hypothèses de fréquentation restent prudentes (taux d’occupation 18 % → 38 %), et la capacité d’autofinancement permet d’honorer le service de la dette avec une marge de sécurité confortable, le décalage de la dernière tranche de prime étant neutralisé par un crédit fournisseur à coût nul.</w:t>
       </w:r>
     </w:p>
     <w:p>

</xml_diff>